<commit_message>
Replace Gemini classification with a locally trained AfroXLMR sentiment model
Trains and ships a local AfroXLMR-small classifier (positive/neutral/negative)
instead of calling the Gemini API, so classification runs entirely offline at
inference time. Includes the full data pipeline (extraction, cleaning,
stratified sampling, French-representation correction) and the training
script with best-checkpoint selection and class-weighted loss.

Also fixes two real parser bugs found on real WhatsApp exports (missing
m/d/y 24h date format, crash on empty-text messages), removes the
duplicate-detection mechanism, and adds a custom date-range filter, a
page-wide loading state during import, and a delete-all-messages action to
the dashboard.

Co-Authored-By: Claude Sonnet 5 <noreply@anthropic.com>
Claude-Session: https://claude.ai/code/session_01LoiewXKf7mA2mJX1bQ6Jt6
</commit_message>
<xml_diff>
--- a/docs/presentation_academique.docx
+++ b/docs/presentation_academique.docx
@@ -29,9 +29,9 @@
           <w:color w:val="1F2937"/>
           <w:sz w:val="28"/>
         </w:rPr>
-        <w:t>Analyse automatisée des sentiments dans les conversations WhatsApp</w:t>
+        <w:t>Entraînement d'un modèle local de classification de sentiment</w:t>
         <w:br/>
-        <w:t>à l'aide d'un modèle de langage multilingue</w:t>
+        <w:t>sur des données réelles issues de WhatsApp</w:t>
       </w:r>
     </w:p>
     <w:p/>
@@ -62,7 +62,7 @@
           <w:color w:val="1F2937"/>
           <w:sz w:val="24"/>
         </w:rPr>
-        <w:t>Auteur : Victoire HABAMUNGU</w:t>
+        <w:t>Auteure : Victoire HABAMUNGU</w:t>
         <w:br/>
         <w:t>Année académique : 2025 - 2026</w:t>
       </w:r>
@@ -133,7 +133,7 @@
           <w:color w:val="1F2937"/>
           <w:sz w:val="24"/>
         </w:rPr>
-        <w:t>4. Revue de la littérature et technologies mobilisées</w:t>
+        <w:t>4. Constitution et préparation du corpus d'entraînement</w:t>
       </w:r>
     </w:p>
     <w:p>
@@ -161,7 +161,7 @@
           <w:color w:val="1F2937"/>
           <w:sz w:val="24"/>
         </w:rPr>
-        <w:t>6. Méthodologie de traitement des données</w:t>
+        <w:t>6. Méthodologie d'entraînement du modèle local</w:t>
       </w:r>
     </w:p>
     <w:p>
@@ -175,7 +175,7 @@
           <w:color w:val="1F2937"/>
           <w:sz w:val="24"/>
         </w:rPr>
-        <w:t>7. Fonctionnalités de l'application</w:t>
+        <w:t>7. Résultats obtenus</w:t>
       </w:r>
     </w:p>
     <w:p>
@@ -189,7 +189,7 @@
           <w:color w:val="1F2937"/>
           <w:sz w:val="24"/>
         </w:rPr>
-        <w:t>8. Présentation de l'interface utilisateur</w:t>
+        <w:t>8. Fonctionnalités de l'application</w:t>
       </w:r>
     </w:p>
     <w:p>
@@ -203,7 +203,7 @@
           <w:color w:val="1F2937"/>
           <w:sz w:val="24"/>
         </w:rPr>
-        <w:t>9. Aspects techniques et choix d'implémentation</w:t>
+        <w:t>9. Difficultés rencontrées et solutions apportées</w:t>
       </w:r>
     </w:p>
     <w:p>
@@ -217,7 +217,7 @@
           <w:color w:val="1F2937"/>
           <w:sz w:val="24"/>
         </w:rPr>
-        <w:t>10. Limites et défis rencontrés</w:t>
+        <w:t>10. Limites actuelles</w:t>
       </w:r>
     </w:p>
     <w:p>
@@ -286,7 +286,7 @@
           <w:color w:val="1F2937"/>
           <w:sz w:val="22"/>
         </w:rPr>
-        <w:t>Les messageries instantanées occupent aujourd'hui une place centrale dans la communication interpersonnelle et collective. Parmi elles, WhatsApp constitue l'une des plateformes les plus utilisées au monde, tant pour les échanges privés que pour les discussions de groupe. Cette abondance d'échanges textuels génère un volume considérable de données non structurées, porteuses d'informations utiles sur l'état émotionnel des participants, la tonalité des discussions et l'évolution du climat relationnel au sein d'un groupe.</w:t>
+        <w:t>Les messageries instantanées occupent une place centrale dans la communication quotidienne. WhatsApp, en particulier, est utilisé aussi bien pour les échanges privés que pour les discussions de groupe, et génère un volume considérable de messages porteurs d'informations sur l'état émotionnel des participants et sur le climat relationnel d'un groupe.</w:t>
       </w:r>
     </w:p>
     <w:p>
@@ -300,7 +300,7 @@
           <w:color w:val="1F2937"/>
           <w:sz w:val="22"/>
         </w:rPr>
-        <w:t>Le présent document accompagne la présentation académique du projet « WhatsApp Sentiment Lab », une application permettant d'importer un export de conversation WhatsApp et d'en analyser automatiquement le sentiment, la langue et l'émotion dominante de chaque message, à l'aide d'un modèle de langage. Il expose de manière structurée le contexte du projet, ses objectifs, son architecture technique, ses fonctionnalités ainsi que les enseignements tirés de sa réalisation.</w:t>
+        <w:t>Ce document présente le projet « WhatsApp Sentiment Lab », une application qui importe un export de conversation WhatsApp et classe automatiquement chaque message selon son sentiment (positif, neutre ou négatif) à l'aide d'un modèle de langage entraîné localement. Il retrace la démarche suivie depuis la constitution du corpus jusqu'à l'entraînement du modèle, en détaillant les difficultés rencontrées et les corrections apportées à chaque étape.</w:t>
       </w:r>
     </w:p>
     <w:p>
@@ -322,7 +322,7 @@
           <w:color w:val="1F2937"/>
           <w:sz w:val="22"/>
         </w:rPr>
-        <w:t>L'analyse de sentiment, ou analyse d'opinion, est un sous-domaine du traitement automatique du langage naturel qui vise à déterminer la polarité affective d'un texte, qu'elle soit positive, négative ou neutre. Appliquée à des conversations de groupe, cette analyse peut révéler des tendances difficiles à percevoir manuellement lorsque le volume de messages devient important, par exemple une dégradation progressive du climat d'échange ou l'apparition d'un pic de messages négatifs sur une courte période.</w:t>
+        <w:t>L'analyse de sentiment appliquée à des conversations de groupe permet de révéler des tendances difficiles à percevoir manuellement lorsque le volume de messages devient important, par exemple une dégradation progressive du climat d'échange. Pour être exploitable dans un cadre académique et fonctionner sans dépendance à un service externe au moment de la classification, un tel système doit reposer sur un modèle réellement entraîné sur un jeu de données constitué pour la tâche, et non sur un service tiers appelé à la volée.</w:t>
       </w:r>
     </w:p>
     <w:p>
@@ -336,21 +336,7 @@
           <w:color w:val="1F2937"/>
           <w:sz w:val="22"/>
         </w:rPr>
-        <w:t>La problématique centrale de ce projet peut être formulée ainsi : comment concevoir un outil capable de traiter un export brut de conversation WhatsApp, rédigé dans un mélange de langues et de registres informels, puis d'en extraire une classification fiable du sentiment et de l'émotion de chaque message, tout en restituant ces résultats de manière lisible et exploitable au sein d'un tableau de bord ?</w:t>
-      </w:r>
-    </w:p>
-    <w:p>
-      <w:pPr>
-        <w:spacing w:after="160"/>
-      </w:pPr>
-      <w:r>
-        <w:rPr>
-          <w:b w:val="0"/>
-          <w:i w:val="0"/>
-          <w:color w:val="1F2937"/>
-          <w:sz w:val="22"/>
-        </w:rPr>
-        <w:t>Cette problématique soulève plusieurs difficultés spécifiques : l'hétérogénéité des formats de date utilisés par WhatsApp selon la version et la langue de l'application, la présence fréquente de plusieurs langues au sein d'un même message, l'usage d'abréviations, d'émojis et d'un langage familier, ainsi que la nécessité de traiter ces données de façon reproductible et sans duplication lors d'imports successifs.</w:t>
+        <w:t>La problématique du projet est donc la suivante : comment constituer un corpus annoté représentatif d'un groupe WhatsApp réel, mêlant français et swahili de Bukavu avec de l'argot et du changement de langue en cours de message, puis entraîner sur ce corpus un classifieur de sentiment fonctionnant entièrement en local, sans dépendance à un service externe au moment de la classification ?</w:t>
       </w:r>
     </w:p>
     <w:p>
@@ -359,20 +345,6 @@
       </w:pPr>
       <w:r>
         <w:t>3. Objectifs du projet</w:t>
-      </w:r>
-    </w:p>
-    <w:p>
-      <w:pPr>
-        <w:spacing w:after="160"/>
-      </w:pPr>
-      <w:r>
-        <w:rPr>
-          <w:b w:val="0"/>
-          <w:i w:val="0"/>
-          <w:color w:val="1F2937"/>
-          <w:sz w:val="22"/>
-        </w:rPr>
-        <w:t>Le projet poursuit un objectif général et plusieurs objectifs spécifiques.</w:t>
       </w:r>
     </w:p>
     <w:p>
@@ -394,7 +366,7 @@
           <w:color w:val="1F2937"/>
           <w:sz w:val="22"/>
         </w:rPr>
-        <w:t>Concevoir et développer une application web permettant d'importer un export de conversation WhatsApp, de classer automatiquement chaque message selon son sentiment et son émotion, puis de visualiser ces résultats sous forme de tableau de bord analytique.</w:t>
+        <w:t>Concevoir, entraîner et intégrer un classifieur de sentiment local, capable de traiter le français et le swahili de Bukavu avec leur argot respectif, à partir de messages réels extraits d'un groupe WhatsApp universitaire.</w:t>
       </w:r>
     </w:p>
     <w:p>
@@ -415,7 +387,7 @@
           <w:color w:val="1F2937"/>
           <w:sz w:val="22"/>
         </w:rPr>
-        <w:t>Développer une interface d'importation acceptant les fichiers texte et les archives compressées issues d'un export WhatsApp.</w:t>
+        <w:t>Extraire et nettoyer des exports WhatsApp réels pour constituer un réservoir de messages exploitables.</w:t>
       </w:r>
     </w:p>
     <w:p>
@@ -428,7 +400,7 @@
           <w:color w:val="1F2937"/>
           <w:sz w:val="22"/>
         </w:rPr>
-        <w:t>Mettre en place un analyseur capable d'interpréter plusieurs formats de date et d'auteur utilisés par WhatsApp.</w:t>
+        <w:t>Annoter un échantillon représentatif de ce réservoir selon trois catégories de sentiment.</w:t>
       </w:r>
     </w:p>
     <w:p>
@@ -441,7 +413,7 @@
           <w:color w:val="1F2937"/>
           <w:sz w:val="22"/>
         </w:rPr>
-        <w:t>Intégrer un modèle de langage pour la classification multilingue du sentiment, de l'émotion et de la langue de chaque message.</w:t>
+        <w:t>Entraîner un classifieur local à partir d'un modèle multilingue pré-entraîné.</w:t>
       </w:r>
     </w:p>
     <w:p>
@@ -454,7 +426,7 @@
           <w:color w:val="1F2937"/>
           <w:sz w:val="22"/>
         </w:rPr>
-        <w:t>Concevoir une base de données locale garantissant l'absence de doublons lors des imports successifs.</w:t>
+        <w:t>Diagnostiquer et corriger les problèmes rencontrés au fil de l'entraînement plutôt que de se contenter d'un premier résultat.</w:t>
       </w:r>
     </w:p>
     <w:p>
@@ -467,20 +439,7 @@
           <w:color w:val="1F2937"/>
           <w:sz w:val="22"/>
         </w:rPr>
-        <w:t>Construire un tableau de bord présentant les tendances de sentiment, la répartition des émotions et la détection de pics de sentiment négatif.</w:t>
-      </w:r>
-    </w:p>
-    <w:p>
-      <w:pPr>
-        <w:pStyle w:val="ListBullet"/>
-        <w:spacing w:after="80"/>
-      </w:pPr>
-      <w:r>
-        <w:rPr>
-          <w:color w:val="1F2937"/>
-          <w:sz w:val="22"/>
-        </w:rPr>
-        <w:t>Offrir une interface de consultation permettant la recherche et le filtrage des messages classés.</w:t>
+        <w:t>Intégrer le modèle entraîné dans une application de tableau de bord.</w:t>
       </w:r>
     </w:p>
     <w:p>
@@ -488,7 +447,15 @@
         <w:pStyle w:val="Heading1"/>
       </w:pPr>
       <w:r>
-        <w:t>4. Revue de la littérature et technologies mobilisées</w:t>
+        <w:t>4. Constitution et préparation du corpus d'entraînement</w:t>
+      </w:r>
+    </w:p>
+    <w:p>
+      <w:pPr>
+        <w:pStyle w:val="Heading2"/>
+      </w:pPr>
+      <w:r>
+        <w:t>4.1. Sources de données</w:t>
       </w:r>
     </w:p>
     <w:p>
@@ -502,29 +469,7 @@
           <w:color w:val="1F2937"/>
           <w:sz w:val="22"/>
         </w:rPr>
-        <w:t>L'analyse de sentiment repose historiquement sur des approches lexicales, fondées sur des dictionnaires de mots associés à une polarité, puis sur des approches d'apprentissage automatique supervisé, entraînées sur des corpus annotés. Plus récemment, les modèles de langage de grande taille ont permis d'aborder cette tâche de manière plus flexible, sans nécessiter d'entraînement spécifique, grâce à leur capacité à comprendre le contexte, les nuances et le mélange de langues présents dans un texte donné.</w:t>
-      </w:r>
-    </w:p>
-    <w:p>
-      <w:pPr>
-        <w:spacing w:after="160"/>
-      </w:pPr>
-      <w:r>
-        <w:rPr>
-          <w:b w:val="0"/>
-          <w:i w:val="0"/>
-          <w:color w:val="1F2937"/>
-          <w:sz w:val="22"/>
-        </w:rPr>
-        <w:t>Ce projet s'inscrit dans cette dernière approche en s'appuyant sur le modèle Gemini de Google, sollicité par une instruction précise décrivant les catégories de sentiment et d'émotion attendues, ainsi que le format de réponse structuré. Cette méthode présente l'avantage de gérer nativement le multilinguisme, un critère essentiel dans le contexte de conversations mêlant le français, l'anglais, le swahili et des expressions familières.</w:t>
-      </w:r>
-    </w:p>
-    <w:p>
-      <w:pPr>
-        <w:pStyle w:val="Heading2"/>
-      </w:pPr>
-      <w:r>
-        <w:t>4.1. Technologies employées</w:t>
+        <w:t>J'ai utilisé quatre exports WhatsApp réels. Le groupe cible du projet, « UCB Bac 2 Informatique », est celui sur lequel le modèle final doit être jugé. Trois autres groupes ont servi à enrichir la diversité linguistique et de registre du corpus d'entraînement, sans être eux-mêmes l'objectif final de classification.</w:t>
       </w:r>
     </w:p>
     <w:tbl>
@@ -542,7 +487,7 @@
       <w:tr>
         <w:tc>
           <w:tcPr>
-            <w:tcW w:type="dxa" w:w="2268"/>
+            <w:tcW w:type="dxa" w:w="3402"/>
             <w:shd w:val="clear" w:color="auto" w:fill="0F6266"/>
           </w:tcPr>
           <w:p>
@@ -551,15 +496,15 @@
               <w:rPr>
                 <w:b/>
                 <w:color w:val="FFFFFF"/>
-                <w:sz w:val="21"/>
+                <w:sz w:val="20"/>
               </w:rPr>
-              <w:t>Composant</w:t>
+              <w:t>Source</w:t>
             </w:r>
           </w:p>
         </w:tc>
         <w:tc>
           <w:tcPr>
-            <w:tcW w:type="dxa" w:w="2551"/>
+            <w:tcW w:type="dxa" w:w="2835"/>
             <w:shd w:val="clear" w:color="auto" w:fill="0F6266"/>
           </w:tcPr>
           <w:p>
@@ -568,15 +513,15 @@
               <w:rPr>
                 <w:b/>
                 <w:color w:val="FFFFFF"/>
-                <w:sz w:val="21"/>
+                <w:sz w:val="20"/>
               </w:rPr>
-              <w:t>Technologie</w:t>
+              <w:t>Rôle</w:t>
             </w:r>
           </w:p>
         </w:tc>
         <w:tc>
           <w:tcPr>
-            <w:tcW w:type="dxa" w:w="4252"/>
+            <w:tcW w:type="dxa" w:w="3118"/>
             <w:shd w:val="clear" w:color="auto" w:fill="0F6266"/>
           </w:tcPr>
           <w:p>
@@ -585,9 +530,9 @@
               <w:rPr>
                 <w:b/>
                 <w:color w:val="FFFFFF"/>
-                <w:sz w:val="21"/>
+                <w:sz w:val="20"/>
               </w:rPr>
-              <w:t>Rôle</w:t>
+              <w:t>Messages exploitables après nettoyage</w:t>
             </w:r>
           </w:p>
         </w:tc>
@@ -595,46 +540,46 @@
       <w:tr>
         <w:tc>
           <w:tcPr>
-            <w:tcW w:type="dxa" w:w="2268"/>
+            <w:tcW w:type="dxa" w:w="3402"/>
           </w:tcPr>
           <w:p>
             <w:r/>
             <w:r>
               <w:rPr>
                 <w:color w:val="1F2937"/>
-                <w:sz w:val="21"/>
+                <w:sz w:val="20"/>
               </w:rPr>
-              <w:t>Interface utilisateur</w:t>
+              <w:t>UCB Bac 2 Informatique</w:t>
             </w:r>
           </w:p>
         </w:tc>
         <w:tc>
           <w:tcPr>
-            <w:tcW w:type="dxa" w:w="2551"/>
+            <w:tcW w:type="dxa" w:w="2835"/>
           </w:tcPr>
           <w:p>
             <w:r/>
             <w:r>
               <w:rPr>
                 <w:color w:val="1F2937"/>
-                <w:sz w:val="21"/>
+                <w:sz w:val="20"/>
               </w:rPr>
-              <w:t>Next.js 15, React 19, TypeScript</w:t>
+              <w:t>Groupe cible</w:t>
             </w:r>
           </w:p>
         </w:tc>
         <w:tc>
           <w:tcPr>
-            <w:tcW w:type="dxa" w:w="4252"/>
+            <w:tcW w:type="dxa" w:w="3118"/>
           </w:tcPr>
           <w:p>
             <w:r/>
             <w:r>
               <w:rPr>
                 <w:color w:val="1F2937"/>
-                <w:sz w:val="21"/>
+                <w:sz w:val="20"/>
               </w:rPr>
-              <w:t>Construction du tableau de bord et des vues de consultation</w:t>
+              <w:t>22 985</w:t>
             </w:r>
           </w:p>
         </w:tc>
@@ -642,46 +587,46 @@
       <w:tr>
         <w:tc>
           <w:tcPr>
-            <w:tcW w:type="dxa" w:w="2268"/>
+            <w:tcW w:type="dxa" w:w="3402"/>
           </w:tcPr>
           <w:p>
             <w:r/>
             <w:r>
               <w:rPr>
                 <w:color w:val="1F2937"/>
-                <w:sz w:val="21"/>
+                <w:sz w:val="20"/>
               </w:rPr>
-              <w:t>Mise en forme visuelle</w:t>
+              <w:t>Groupe sportif (PRINCE OBIB)</w:t>
             </w:r>
           </w:p>
         </w:tc>
         <w:tc>
           <w:tcPr>
-            <w:tcW w:type="dxa" w:w="2551"/>
+            <w:tcW w:type="dxa" w:w="2835"/>
           </w:tcPr>
           <w:p>
             <w:r/>
             <w:r>
               <w:rPr>
                 <w:color w:val="1F2937"/>
-                <w:sz w:val="21"/>
+                <w:sz w:val="20"/>
               </w:rPr>
-              <w:t>Tailwind CSS, Radix UI, Recharts</w:t>
+              <w:t>Diversité linguistique</w:t>
             </w:r>
           </w:p>
         </w:tc>
         <w:tc>
           <w:tcPr>
-            <w:tcW w:type="dxa" w:w="4252"/>
+            <w:tcW w:type="dxa" w:w="3118"/>
           </w:tcPr>
           <w:p>
             <w:r/>
             <w:r>
               <w:rPr>
                 <w:color w:val="1F2937"/>
-                <w:sz w:val="21"/>
+                <w:sz w:val="20"/>
               </w:rPr>
-              <w:t>Composants d'interface et graphiques de tendance</w:t>
+              <w:t>19 599</w:t>
             </w:r>
           </w:p>
         </w:tc>
@@ -689,46 +634,46 @@
       <w:tr>
         <w:tc>
           <w:tcPr>
-            <w:tcW w:type="dxa" w:w="2268"/>
+            <w:tcW w:type="dxa" w:w="3402"/>
           </w:tcPr>
           <w:p>
             <w:r/>
             <w:r>
               <w:rPr>
                 <w:color w:val="1F2937"/>
-                <w:sz w:val="21"/>
+                <w:sz w:val="20"/>
               </w:rPr>
-              <w:t>Serveur applicatif</w:t>
+              <w:t>Équipe produit Kelor Tech</w:t>
             </w:r>
           </w:p>
         </w:tc>
         <w:tc>
           <w:tcPr>
-            <w:tcW w:type="dxa" w:w="2551"/>
+            <w:tcW w:type="dxa" w:w="2835"/>
           </w:tcPr>
           <w:p>
             <w:r/>
             <w:r>
               <w:rPr>
                 <w:color w:val="1F2937"/>
-                <w:sz w:val="21"/>
+                <w:sz w:val="20"/>
               </w:rPr>
-              <w:t>FastAPI, Uvicorn</w:t>
+              <w:t>Diversité linguistique</w:t>
             </w:r>
           </w:p>
         </w:tc>
         <w:tc>
           <w:tcPr>
-            <w:tcW w:type="dxa" w:w="4252"/>
+            <w:tcW w:type="dxa" w:w="3118"/>
           </w:tcPr>
           <w:p>
             <w:r/>
             <w:r>
               <w:rPr>
                 <w:color w:val="1F2937"/>
-                <w:sz w:val="21"/>
+                <w:sz w:val="20"/>
               </w:rPr>
-              <w:t>Exposition de l'API HTTP</w:t>
+              <w:t>432</w:t>
             </w:r>
           </w:p>
         </w:tc>
@@ -736,98 +681,123 @@
       <w:tr>
         <w:tc>
           <w:tcPr>
-            <w:tcW w:type="dxa" w:w="2268"/>
+            <w:tcW w:type="dxa" w:w="3402"/>
           </w:tcPr>
           <w:p>
             <w:r/>
             <w:r>
               <w:rPr>
                 <w:color w:val="1F2937"/>
-                <w:sz w:val="21"/>
+                <w:sz w:val="20"/>
               </w:rPr>
-              <w:t>Classification</w:t>
+              <w:t>Promotion A6 19-20</w:t>
             </w:r>
           </w:p>
         </w:tc>
         <w:tc>
           <w:tcPr>
-            <w:tcW w:type="dxa" w:w="2551"/>
+            <w:tcW w:type="dxa" w:w="2835"/>
           </w:tcPr>
           <w:p>
             <w:r/>
             <w:r>
               <w:rPr>
                 <w:color w:val="1F2937"/>
-                <w:sz w:val="21"/>
+                <w:sz w:val="20"/>
               </w:rPr>
-              <w:t>API Gemini (google-genai)</w:t>
+              <w:t>Diversité linguistique</w:t>
             </w:r>
           </w:p>
         </w:tc>
         <w:tc>
           <w:tcPr>
-            <w:tcW w:type="dxa" w:w="4252"/>
+            <w:tcW w:type="dxa" w:w="3118"/>
           </w:tcPr>
           <w:p>
             <w:r/>
             <w:r>
               <w:rPr>
                 <w:color w:val="1F2937"/>
-                <w:sz w:val="21"/>
+                <w:sz w:val="20"/>
               </w:rPr>
-              <w:t>Détection du sentiment, de l'émotion et de la langue</w:t>
-            </w:r>
-          </w:p>
-        </w:tc>
-      </w:tr>
-      <w:tr>
-        <w:tc>
-          <w:tcPr>
-            <w:tcW w:type="dxa" w:w="2268"/>
-          </w:tcPr>
-          <w:p>
-            <w:r/>
-            <w:r>
-              <w:rPr>
-                <w:color w:val="1F2937"/>
-                <w:sz w:val="21"/>
-              </w:rPr>
-              <w:t>Persistance des données</w:t>
-            </w:r>
-          </w:p>
-        </w:tc>
-        <w:tc>
-          <w:tcPr>
-            <w:tcW w:type="dxa" w:w="2551"/>
-          </w:tcPr>
-          <w:p>
-            <w:r/>
-            <w:r>
-              <w:rPr>
-                <w:color w:val="1F2937"/>
-                <w:sz w:val="21"/>
-              </w:rPr>
-              <w:t>SQLite</w:t>
-            </w:r>
-          </w:p>
-        </w:tc>
-        <w:tc>
-          <w:tcPr>
-            <w:tcW w:type="dxa" w:w="4252"/>
-          </w:tcPr>
-          <w:p>
-            <w:r/>
-            <w:r>
-              <w:rPr>
-                <w:color w:val="1F2937"/>
-                <w:sz w:val="21"/>
-              </w:rPr>
-              <w:t>Stockage des messages classés</w:t>
+              <w:t>64</w:t>
             </w:r>
           </w:p>
         </w:tc>
       </w:tr>
     </w:tbl>
+    <w:p>
+      <w:pPr>
+        <w:spacing w:after="160"/>
+      </w:pPr>
+      <w:r>
+        <w:rPr>
+          <w:b w:val="0"/>
+          <w:i w:val="0"/>
+          <w:color w:val="1F2937"/>
+          <w:sz w:val="22"/>
+        </w:rPr>
+        <w:t>Au total, 43 080 messages exploitables ont été extraits de ces quatre sources, après élimination des messages système de WhatsApp (ajouts au groupe, médias omis, avis de chiffrement, marqueurs de message modifié) et des doublons exacts.</w:t>
+      </w:r>
+    </w:p>
+    <w:p>
+      <w:pPr>
+        <w:pStyle w:val="Heading2"/>
+      </w:pPr>
+      <w:r>
+        <w:t>4.2. Extraction et nettoyage</w:t>
+      </w:r>
+    </w:p>
+    <w:p>
+      <w:pPr>
+        <w:spacing w:after="160"/>
+      </w:pPr>
+      <w:r>
+        <w:rPr>
+          <w:b w:val="0"/>
+          <w:i w:val="0"/>
+          <w:color w:val="1F2937"/>
+          <w:sz w:val="22"/>
+        </w:rPr>
+        <w:t>L'extraction réutilise l'analyseur de conversation déjà présent dans l'application (reconnaissance des deux formats de ligne WhatsApp et des différents formats de date). Ce travail d'extraction sur des données réelles a révélé deux anomalies du code qui n'étaient pas visibles avec des exemples fabriqués à la main : un format de date américain sur 24 heures non reconnu, provoquant l'échec de l'analyse dès la première ligne concernée, et un message au texte vide (par exemple un message supprimé) qui faisait échouer l'extraction de son contenu. Les deux anomalies ont été corrigées directement dans le code d'analyse.</w:t>
+      </w:r>
+    </w:p>
+    <w:p>
+      <w:pPr>
+        <w:pStyle w:val="Heading2"/>
+      </w:pPr>
+      <w:r>
+        <w:t>4.3. Premières annotations et déséquilibre linguistique</w:t>
+      </w:r>
+    </w:p>
+    <w:p>
+      <w:pPr>
+        <w:spacing w:after="160"/>
+      </w:pPr>
+      <w:r>
+        <w:rPr>
+          <w:b w:val="0"/>
+          <w:i w:val="0"/>
+          <w:color w:val="1F2937"/>
+          <w:sz w:val="22"/>
+        </w:rPr>
+        <w:t>J'ai prélevé un premier échantillon stratifié de 964 messages, pondéré vers le groupe cible (500 messages sur 22 985), et je l'ai annoté selon trois catégories : positif, neutre, négatif. Cette première annotation a donné 225 messages positifs, 534 neutres et 205 négatifs.</w:t>
+      </w:r>
+    </w:p>
+    <w:p>
+      <w:pPr>
+        <w:spacing w:after="160"/>
+      </w:pPr>
+      <w:r>
+        <w:rPr>
+          <w:b w:val="0"/>
+          <w:i w:val="0"/>
+          <w:color w:val="1F2937"/>
+          <w:sz w:val="22"/>
+        </w:rPr>
+        <w:t>En comparant la composition linguistique de cet échantillon à la langue principale réelle du groupe, j'ai constaté que le français n'y représentait qu'environ 27 % des messages, une proportion insuffisante puisque le français est la langue principale du groupe cible. J'ai donc prélevé un second lot de 604 messages supplémentaires, sélectionnés spécifiquement pour leur dominante française, et je les ai annotés de la même manière. Le corpus final compte ainsi 1 568 messages annotés.</w:t>
+      </w:r>
+    </w:p>
     <w:p>
       <w:pPr>
         <w:pStyle w:val="Heading1"/>
@@ -847,29 +817,7 @@
           <w:color w:val="1F2937"/>
           <w:sz w:val="22"/>
         </w:rPr>
-        <w:t>L'application adopte une architecture client-serveur classique, structurée en deux parties distinctes et indépendantes : un backend exposant une interface de programmation applicative, et un client web consommant cette interface.</w:t>
-      </w:r>
-    </w:p>
-    <w:p>
-      <w:pPr>
-        <w:pStyle w:val="Heading2"/>
-      </w:pPr>
-      <w:r>
-        <w:t>5.1. Le backend</w:t>
-      </w:r>
-    </w:p>
-    <w:p>
-      <w:pPr>
-        <w:spacing w:after="160"/>
-      </w:pPr>
-      <w:r>
-        <w:rPr>
-          <w:b w:val="0"/>
-          <w:i w:val="0"/>
-          <w:color w:val="1F2937"/>
-          <w:sz w:val="22"/>
-        </w:rPr>
-        <w:t>Le backend, développé avec FastAPI, assure quatre responsabilités principales : la réception et l'extraction des fichiers importés, l'analyse syntaxique du texte de conversation, la classification des messages via le modèle Gemini, et le calcul des indicateurs présentés dans le tableau de bord. Il est organisé en modules distincts, chacun correspondant à une responsabilité précise.</w:t>
+        <w:t>L'architecture reste celle d'une application client-serveur : un backend FastAPI expose une API HTTP consommée par un client Next.js. Le seul changement structurel porte sur le module de classification, qui n'appelle plus une API externe mais charge un modèle entraîné localement à partir d'un dossier sur disque.</w:t>
       </w:r>
     </w:p>
     <w:tbl>
@@ -886,7 +834,7 @@
       <w:tr>
         <w:tc>
           <w:tcPr>
-            <w:tcW w:type="dxa" w:w="2551"/>
+            <w:tcW w:type="dxa" w:w="3969"/>
             <w:shd w:val="clear" w:color="auto" w:fill="0F6266"/>
           </w:tcPr>
           <w:p>
@@ -895,7 +843,7 @@
               <w:rPr>
                 <w:b/>
                 <w:color w:val="FFFFFF"/>
-                <w:sz w:val="21"/>
+                <w:sz w:val="20"/>
               </w:rPr>
               <w:t>Module</w:t>
             </w:r>
@@ -903,7 +851,7 @@
         </w:tc>
         <w:tc>
           <w:tcPr>
-            <w:tcW w:type="dxa" w:w="6520"/>
+            <w:tcW w:type="dxa" w:w="5386"/>
             <w:shd w:val="clear" w:color="auto" w:fill="0F6266"/>
           </w:tcPr>
           <w:p>
@@ -912,9 +860,9 @@
               <w:rPr>
                 <w:b/>
                 <w:color w:val="FFFFFF"/>
-                <w:sz w:val="21"/>
+                <w:sz w:val="20"/>
               </w:rPr>
-              <w:t>Responsabilité</w:t>
+              <w:t>Rôle</w:t>
             </w:r>
           </w:p>
         </w:tc>
@@ -922,14 +870,14 @@
       <w:tr>
         <w:tc>
           <w:tcPr>
-            <w:tcW w:type="dxa" w:w="2551"/>
+            <w:tcW w:type="dxa" w:w="3969"/>
           </w:tcPr>
           <w:p>
             <w:r/>
             <w:r>
               <w:rPr>
                 <w:color w:val="1F2937"/>
-                <w:sz w:val="21"/>
+                <w:sz w:val="20"/>
               </w:rPr>
               <w:t>app.py</w:t>
             </w:r>
@@ -937,16 +885,16 @@
         </w:tc>
         <w:tc>
           <w:tcPr>
-            <w:tcW w:type="dxa" w:w="6520"/>
+            <w:tcW w:type="dxa" w:w="5386"/>
           </w:tcPr>
           <w:p>
             <w:r/>
             <w:r>
               <w:rPr>
                 <w:color w:val="1F2937"/>
-                <w:sz w:val="21"/>
+                <w:sz w:val="20"/>
               </w:rPr>
-              <w:t>Définition des routes de l'API et orchestration des requêtes</w:t>
+              <w:t>Routes de l'API et orchestration des requêtes</w:t>
             </w:r>
           </w:p>
         </w:tc>
@@ -954,14 +902,14 @@
       <w:tr>
         <w:tc>
           <w:tcPr>
-            <w:tcW w:type="dxa" w:w="2551"/>
+            <w:tcW w:type="dxa" w:w="3969"/>
           </w:tcPr>
           <w:p>
             <w:r/>
             <w:r>
               <w:rPr>
                 <w:color w:val="1F2937"/>
-                <w:sz w:val="21"/>
+                <w:sz w:val="20"/>
               </w:rPr>
               <w:t>uploads.py</w:t>
             </w:r>
@@ -969,16 +917,16 @@
         </w:tc>
         <w:tc>
           <w:tcPr>
-            <w:tcW w:type="dxa" w:w="6520"/>
+            <w:tcW w:type="dxa" w:w="5386"/>
           </w:tcPr>
           <w:p>
             <w:r/>
             <w:r>
               <w:rPr>
                 <w:color w:val="1F2937"/>
-                <w:sz w:val="21"/>
+                <w:sz w:val="20"/>
               </w:rPr>
-              <w:t>Extraction des fichiers, analyse du texte exporté et détection des doublons</w:t>
+              <w:t>Extraction des fichiers et analyse du texte exporté</w:t>
             </w:r>
           </w:p>
         </w:tc>
@@ -986,31 +934,31 @@
       <w:tr>
         <w:tc>
           <w:tcPr>
-            <w:tcW w:type="dxa" w:w="2551"/>
+            <w:tcW w:type="dxa" w:w="3969"/>
           </w:tcPr>
           <w:p>
             <w:r/>
             <w:r>
               <w:rPr>
                 <w:color w:val="1F2937"/>
-                <w:sz w:val="21"/>
+                <w:sz w:val="20"/>
               </w:rPr>
-              <w:t>gemini.py</w:t>
+              <w:t>local_model.py</w:t>
             </w:r>
           </w:p>
         </w:tc>
         <w:tc>
           <w:tcPr>
-            <w:tcW w:type="dxa" w:w="6520"/>
+            <w:tcW w:type="dxa" w:w="5386"/>
           </w:tcPr>
           <w:p>
             <w:r/>
             <w:r>
               <w:rPr>
                 <w:color w:val="1F2937"/>
-                <w:sz w:val="21"/>
+                <w:sz w:val="20"/>
               </w:rPr>
-              <w:t>Appel au modèle Gemini par lots de messages et validation stricte de chaque réponse obtenue</w:t>
+              <w:t>Chargement du modèle entraîné et inférence locale</w:t>
             </w:r>
           </w:p>
         </w:tc>
@@ -1018,14 +966,110 @@
       <w:tr>
         <w:tc>
           <w:tcPr>
-            <w:tcW w:type="dxa" w:w="2551"/>
+            <w:tcW w:type="dxa" w:w="3969"/>
           </w:tcPr>
           <w:p>
             <w:r/>
             <w:r>
               <w:rPr>
                 <w:color w:val="1F2937"/>
-                <w:sz w:val="21"/>
+                <w:sz w:val="20"/>
+              </w:rPr>
+              <w:t>train_model.py</w:t>
+            </w:r>
+          </w:p>
+        </w:tc>
+        <w:tc>
+          <w:tcPr>
+            <w:tcW w:type="dxa" w:w="5386"/>
+          </w:tcPr>
+          <w:p>
+            <w:r/>
+            <w:r>
+              <w:rPr>
+                <w:color w:val="1F2937"/>
+                <w:sz w:val="20"/>
+              </w:rPr>
+              <w:t>Script d'entraînement du classifieur</w:t>
+            </w:r>
+          </w:p>
+        </w:tc>
+      </w:tr>
+      <w:tr>
+        <w:tc>
+          <w:tcPr>
+            <w:tcW w:type="dxa" w:w="3969"/>
+          </w:tcPr>
+          <w:p>
+            <w:r/>
+            <w:r>
+              <w:rPr>
+                <w:color w:val="1F2937"/>
+                <w:sz w:val="20"/>
+              </w:rPr>
+              <w:t>prepare_training_data.py</w:t>
+            </w:r>
+          </w:p>
+        </w:tc>
+        <w:tc>
+          <w:tcPr>
+            <w:tcW w:type="dxa" w:w="5386"/>
+          </w:tcPr>
+          <w:p>
+            <w:r/>
+            <w:r>
+              <w:rPr>
+                <w:color w:val="1F2937"/>
+                <w:sz w:val="20"/>
+              </w:rPr>
+              <w:t>Extraction et nettoyage des exports bruts</w:t>
+            </w:r>
+          </w:p>
+        </w:tc>
+      </w:tr>
+      <w:tr>
+        <w:tc>
+          <w:tcPr>
+            <w:tcW w:type="dxa" w:w="3969"/>
+          </w:tcPr>
+          <w:p>
+            <w:r/>
+            <w:r>
+              <w:rPr>
+                <w:color w:val="1F2937"/>
+                <w:sz w:val="20"/>
+              </w:rPr>
+              <w:t>sample_for_annotation.py / sample_more_french.py</w:t>
+            </w:r>
+          </w:p>
+        </w:tc>
+        <w:tc>
+          <w:tcPr>
+            <w:tcW w:type="dxa" w:w="5386"/>
+          </w:tcPr>
+          <w:p>
+            <w:r/>
+            <w:r>
+              <w:rPr>
+                <w:color w:val="1F2937"/>
+                <w:sz w:val="20"/>
+              </w:rPr>
+              <w:t>Échantillonnage stratifié pour l'annotation</w:t>
+            </w:r>
+          </w:p>
+        </w:tc>
+      </w:tr>
+      <w:tr>
+        <w:tc>
+          <w:tcPr>
+            <w:tcW w:type="dxa" w:w="3969"/>
+          </w:tcPr>
+          <w:p>
+            <w:r/>
+            <w:r>
+              <w:rPr>
+                <w:color w:val="1F2937"/>
+                <w:sz w:val="20"/>
               </w:rPr>
               <w:t>analytics.py</w:t>
             </w:r>
@@ -1033,16 +1077,16 @@
         </w:tc>
         <w:tc>
           <w:tcPr>
-            <w:tcW w:type="dxa" w:w="6520"/>
+            <w:tcW w:type="dxa" w:w="5386"/>
           </w:tcPr>
           <w:p>
             <w:r/>
             <w:r>
               <w:rPr>
                 <w:color w:val="1F2937"/>
-                <w:sz w:val="21"/>
+                <w:sz w:val="20"/>
               </w:rPr>
-              <w:t>Calcul des indicateurs de tendance et détection des pics négatifs</w:t>
+              <w:t>Calcul des indicateurs du tableau de bord</w:t>
             </w:r>
           </w:p>
         </w:tc>
@@ -1050,14 +1094,14 @@
       <w:tr>
         <w:tc>
           <w:tcPr>
-            <w:tcW w:type="dxa" w:w="2551"/>
+            <w:tcW w:type="dxa" w:w="3969"/>
           </w:tcPr>
           <w:p>
             <w:r/>
             <w:r>
               <w:rPr>
                 <w:color w:val="1F2937"/>
-                <w:sz w:val="21"/>
+                <w:sz w:val="20"/>
               </w:rPr>
               <w:t>storage.py</w:t>
             </w:r>
@@ -1065,48 +1109,16 @@
         </w:tc>
         <w:tc>
           <w:tcPr>
-            <w:tcW w:type="dxa" w:w="6520"/>
+            <w:tcW w:type="dxa" w:w="5386"/>
           </w:tcPr>
           <w:p>
             <w:r/>
             <w:r>
               <w:rPr>
                 <w:color w:val="1F2937"/>
-                <w:sz w:val="21"/>
+                <w:sz w:val="20"/>
               </w:rPr>
               <w:t>Accès à la base de données SQLite</w:t>
-            </w:r>
-          </w:p>
-        </w:tc>
-      </w:tr>
-      <w:tr>
-        <w:tc>
-          <w:tcPr>
-            <w:tcW w:type="dxa" w:w="2551"/>
-          </w:tcPr>
-          <w:p>
-            <w:r/>
-            <w:r>
-              <w:rPr>
-                <w:color w:val="1F2937"/>
-                <w:sz w:val="21"/>
-              </w:rPr>
-              <w:t>settings.py</w:t>
-            </w:r>
-          </w:p>
-        </w:tc>
-        <w:tc>
-          <w:tcPr>
-            <w:tcW w:type="dxa" w:w="6520"/>
-          </w:tcPr>
-          <w:p>
-            <w:r/>
-            <w:r>
-              <w:rPr>
-                <w:color w:val="1F2937"/>
-                <w:sz w:val="21"/>
-              </w:rPr>
-              <w:t>Paramètres de configuration centralisés</w:t>
             </w:r>
           </w:p>
         </w:tc>
@@ -1114,10 +1126,10 @@
     </w:tbl>
     <w:p>
       <w:pPr>
-        <w:pStyle w:val="Heading2"/>
+        <w:pStyle w:val="Heading1"/>
       </w:pPr>
       <w:r>
-        <w:t>5.2. Le client</w:t>
+        <w:t>6. Méthodologie d'entraînement du modèle local</w:t>
       </w:r>
     </w:p>
     <w:p>
@@ -1131,7 +1143,7 @@
           <w:color w:val="1F2937"/>
           <w:sz w:val="22"/>
         </w:rPr>
-        <w:t>Le client, développé avec Next.js, consomme l'API du backend afin de présenter les résultats sous forme de tableau de bord interactif. Il comprend une zone d'importation de fichier, une vue d'ensemble avec graphiques de tendance, et une vue de consultation des messages avec recherche et filtrage par sentiment.</w:t>
+        <w:t>Cette section retrace l'entraînement dans l'ordre où il s'est déroulé. Chaque tentative a été évaluée sur un ensemble de validation et un ensemble de test distincts (15 % des données chacun), afin de mesurer objectivement si une modification apportait une réelle amélioration.</w:t>
       </w:r>
     </w:p>
     <w:p>
@@ -1139,127 +1151,7 @@
         <w:pStyle w:val="Heading2"/>
       </w:pPr>
       <w:r>
-        <w:t>5.3. Schéma du flux de traitement</w:t>
-      </w:r>
-    </w:p>
-    <w:p>
-      <w:pPr>
-        <w:pStyle w:val="ListNumber"/>
-        <w:spacing w:after="80"/>
-      </w:pPr>
-      <w:r>
-        <w:rPr>
-          <w:color w:val="1F2937"/>
-          <w:sz w:val="22"/>
-        </w:rPr>
-        <w:t>L'utilisateur dépose un fichier d'export WhatsApp au format .txt ou .zip dans l'interface.</w:t>
-      </w:r>
-    </w:p>
-    <w:p>
-      <w:pPr>
-        <w:pStyle w:val="ListNumber"/>
-        <w:spacing w:after="80"/>
-      </w:pPr>
-      <w:r>
-        <w:rPr>
-          <w:color w:val="1F2937"/>
-          <w:sz w:val="22"/>
-        </w:rPr>
-        <w:t>Le backend extrait le contenu textuel et vérifie sa conformité aux limites de taille définies.</w:t>
-      </w:r>
-    </w:p>
-    <w:p>
-      <w:pPr>
-        <w:pStyle w:val="ListNumber"/>
-        <w:spacing w:after="80"/>
-      </w:pPr>
-      <w:r>
-        <w:rPr>
-          <w:color w:val="1F2937"/>
-          <w:sz w:val="22"/>
-        </w:rPr>
-        <w:t>Le texte est découpé en messages individuels, chacun associé à un horodatage.</w:t>
-      </w:r>
-    </w:p>
-    <w:p>
-      <w:pPr>
-        <w:pStyle w:val="ListNumber"/>
-        <w:spacing w:after="80"/>
-      </w:pPr>
-      <w:r>
-        <w:rPr>
-          <w:color w:val="1F2937"/>
-          <w:sz w:val="22"/>
-        </w:rPr>
-        <w:t>Les messages déjà présents dans la base sont écartés grâce à leur empreinte unique, et seuls les nouveaux messages sont conservés pour la suite du traitement.</w:t>
-      </w:r>
-    </w:p>
-    <w:p>
-      <w:pPr>
-        <w:pStyle w:val="ListNumber"/>
-        <w:spacing w:after="80"/>
-      </w:pPr>
-      <w:r>
-        <w:rPr>
-          <w:color w:val="1F2937"/>
-          <w:sz w:val="22"/>
-        </w:rPr>
-        <w:t>Les nouveaux messages sont regroupés en lots successifs, dont la taille est fixée par le paramètre GEMINI_BATCH_SIZE, puis chaque lot est soumis au modèle Gemini en un seul appel.</w:t>
-      </w:r>
-    </w:p>
-    <w:p>
-      <w:pPr>
-        <w:pStyle w:val="ListNumber"/>
-        <w:spacing w:after="80"/>
-      </w:pPr>
-      <w:r>
-        <w:rPr>
-          <w:color w:val="1F2937"/>
-          <w:sz w:val="22"/>
-        </w:rPr>
-        <w:t>La réponse de chaque lot est validée strictement, message par message, avant tout enregistrement.</w:t>
-      </w:r>
-    </w:p>
-    <w:p>
-      <w:pPr>
-        <w:pStyle w:val="ListNumber"/>
-        <w:spacing w:after="80"/>
-      </w:pPr>
-      <w:r>
-        <w:rPr>
-          <w:color w:val="1F2937"/>
-          <w:sz w:val="22"/>
-        </w:rPr>
-        <w:t>Les messages classés sont insérés dans la base de données SQLite.</w:t>
-      </w:r>
-    </w:p>
-    <w:p>
-      <w:pPr>
-        <w:pStyle w:val="ListNumber"/>
-        <w:spacing w:after="80"/>
-      </w:pPr>
-      <w:r>
-        <w:rPr>
-          <w:color w:val="1F2937"/>
-          <w:sz w:val="22"/>
-        </w:rPr>
-        <w:t>Le tableau de bord interroge l'API pour afficher les tendances et les indicateurs à jour.</w:t>
-      </w:r>
-    </w:p>
-    <w:p>
-      <w:pPr>
-        <w:pStyle w:val="Heading1"/>
-      </w:pPr>
-      <w:r>
-        <w:t>6. Méthodologie de traitement des données</w:t>
-      </w:r>
-    </w:p>
-    <w:p>
-      <w:pPr>
-        <w:pStyle w:val="Heading2"/>
-      </w:pPr>
-      <w:r>
-        <w:t>6.1. Analyse du fichier d'export</w:t>
+        <w:t>6.1. Choix du modèle de base</w:t>
       </w:r>
     </w:p>
     <w:p>
@@ -1273,7 +1165,7 @@
           <w:color w:val="1F2937"/>
           <w:sz w:val="22"/>
         </w:rPr>
-        <w:t>WhatsApp propose plusieurs formats d'export selon la version de l'application, la langue et le système d'exploitation utilisés. L'application reconnaît deux structures principales de ligne, l'une entourée de crochets, l'autre séparée par un tiret, et prend en charge plusieurs formats de date afin de couvrir la majorité des cas rencontrés. Les messages répartis sur plusieurs lignes sont correctement rattachés au message initial.</w:t>
+        <w:t>J'ai choisi AfroXLMR-small (Davlan/afro-xlmr-small) comme encodeur de départ. Ce modèle, dérivé de XLM-RoBERTa, a été pré-entraîné sur un ensemble de langues africaines et convient donc mieux au swahili de Bukavu qu'un modèle multilingue générique. Sa taille réduite permet un entraînement sur processeur, sans carte graphique.</w:t>
       </w:r>
     </w:p>
     <w:p>
@@ -1281,7 +1173,7 @@
         <w:pStyle w:val="Heading2"/>
       </w:pPr>
       <w:r>
-        <w:t>6.2. Classification par modèle de langage</w:t>
+        <w:t>6.2. Première tentative : classifieur figé et taux d'apprentissage inadapté</w:t>
       </w:r>
     </w:p>
     <w:p>
@@ -1295,7 +1187,7 @@
           <w:color w:val="1F2937"/>
           <w:sz w:val="22"/>
         </w:rPr>
-        <w:t>Les messages ne sont pas soumis un à un au modèle Gemini, mais regroupés en lots avant l'appel, ce qui réduit le nombre de requêtes effectuées et limite la répétition inutile des instructions de classification à chaque appel. La taille du lot est fixée par le paramètre GEMINI_BATCH_SIZE, défini dans le fichier de configuration du backend et établi par défaut à vingt-cinq messages. Pour chaque lot, une instruction unique précise quatre catégories de sentiment (positif, neutre, négatif, inconnu) et neuf catégories d'émotion (joie, gratitude, enthousiasme, colère, tristesse, frustration, confusion, neutre, autre), et demande au modèle de détecter la langue de chaque message ainsi que d'en produire un court résumé en français.</w:t>
+        <w:t>La première tentative gelait les poids de l'encodeur et n'entraînait qu'une tête de classification linéaire ajoutée au-dessus, avec un taux d'apprentissage de 2e-5 sur 3 époques. La perte d'entraînement n'a presque pas bougé (de 1,038 à 1,001), et le modèle obtenu se contentait de toujours prédire la classe majoritaire : exactitude de 53 %, F1 macro de seulement 0,23, deux valeurs qui correspondent exactement à ce qu'obtiendrait un classifieur prédisant systématiquement « neutre ».</w:t>
       </w:r>
     </w:p>
     <w:p>
@@ -1309,7 +1201,15 @@
           <w:color w:val="1F2937"/>
           <w:sz w:val="22"/>
         </w:rPr>
-        <w:t>La réponse attendue est structurée au format JSON et associe à chaque message un identifiant numérique correspondant à sa position dans le lot. Cette structure permet de vérifier, après réception, que le modèle a bien renvoyé exactement un résultat par message soumis, sans identifiant manquant ni dupliqué, avant d'appliquer la même validation stricte que pour une classification individuelle. Si le nombre de résultats obtenus ne correspond pas au nombre de messages envoyés dans le lot, l'ensemble du lot est rejeté et une erreur est levée plutôt que d'enregistrer une classification incomplète ou mal alignée.</w:t>
+        <w:t>J'ai identifié la cause : un taux d'apprentissage de 2e-5, adapté à l'ajustement d'un modèle déjà entraîné, est beaucoup trop faible pour entraîner une tête de classification initialisée aléatoirement.</w:t>
+      </w:r>
+    </w:p>
+    <w:p>
+      <w:pPr>
+        <w:pStyle w:val="Heading2"/>
+      </w:pPr>
+      <w:r>
+        <w:t>6.3. Deuxième tentative : ajustement du taux d'apprentissage</w:t>
       </w:r>
     </w:p>
     <w:p>
@@ -1323,7 +1223,7 @@
           <w:color w:val="1F2937"/>
           <w:sz w:val="22"/>
         </w:rPr>
-        <w:t>Cette approche par lots ne modifie pas la logique de classification proprement dite : elle en change uniquement la granularité d'appel. Un import volumineux est ainsi découpé en plusieurs lots successifs de taille fixe, chacun traité par un appel distinct au modèle, ce qui répartit la charge tout en conservant un contrôle strict sur la fiabilité des résultats obtenus.</w:t>
+        <w:t>J'ai relevé le taux d'apprentissage à 1e-3 pour l'entraînement de la tête seule et porté l'entraînement à 8 époques. Le F1 macro de validation est passé à 0,47, mais la perte a stagné autour de 0,92 après la troisième époque et l'écart entre validation (62 % d'exactitude) et test (49 %) restait important. J'en ai conclu que les représentations figées de l'encodeur, issues d'un pré-entraînement par masquage de mots et non par une tâche de sentiment, n'étaient pas suffisamment séparables pour cette tâche avec une simple tête linéaire.</w:t>
       </w:r>
     </w:p>
     <w:p>
@@ -1331,7 +1231,7 @@
         <w:pStyle w:val="Heading2"/>
       </w:pPr>
       <w:r>
-        <w:t>6.3. Prévention des doublons</w:t>
+        <w:t>6.4. Ajustement complet du modèle et surapprentissage</w:t>
       </w:r>
     </w:p>
     <w:p>
@@ -1345,15 +1245,7 @@
           <w:color w:val="1F2937"/>
           <w:sz w:val="22"/>
         </w:rPr>
-        <w:t>Afin d'éviter qu'une même conversation importée à plusieurs reprises ne génère des entrées dupliquées, chaque message se voit attribuer une empreinte unique combinant son horodatage et son contenu textuel. Cette empreinte est vérifiée avant chaque insertion, ce qui permet de ne traiter et de ne classer que les messages réellement nouveaux.</w:t>
-      </w:r>
-    </w:p>
-    <w:p>
-      <w:pPr>
-        <w:pStyle w:val="Heading2"/>
-      </w:pPr>
-      <w:r>
-        <w:t>6.4. Détection des pics de sentiment négatif</w:t>
+        <w:t>J'ai alors dégelé l'ensemble du modèle (option d'ajustement complet), avec un taux d'apprentissage de 2e-5 adapté à ce régime et une taille de lot réduite à 4 pour tenir compte de la mémoire disponible. Sur 4 époques, la perte a diminué régulièrement (de 1,00 à 0,67) et le F1 macro de test a atteint 0,505, la meilleure valeur obtenue jusque-là. Une vérification qualitative sur des messages réels non vus du groupe cible a toutefois révélé des erreurs nettes : des messages factuels (un montant de transfert, une simple question) étaient classés négatifs avec une confiance élevée.</w:t>
       </w:r>
     </w:p>
     <w:p>
@@ -1367,166 +1259,15 @@
           <w:color w:val="1F2937"/>
           <w:sz w:val="22"/>
         </w:rPr>
-        <w:t>Le module d'analyse calcule, pour chaque période sélectionnée, le taux de messages négatifs sur les dernières vingt-quatre heures et le compare à un seuil de référence ainsi qu'au taux observé sur la période précédente. Lorsque ce taux dépasse un seuil défini et qu'un nombre minimal de messages négatifs est atteint, une alerte signalant un pic de sentiment négatif est générée et affichée dans le tableau de bord.</w:t>
+        <w:t>En poursuivant l'entraînement jusqu'à 10 époques sans autre changement, la perte d'entraînement est descendue jusqu'à 0,087, signe d'une mémorisation quasi complète du jeu d'entraînement, mais le F1 macro de test a légèrement reculé à 0,467 : le modèle avait dépassé son point optimal aux alentours de la quatrième ou cinquième époque et surapprenait au-delà.</w:t>
       </w:r>
     </w:p>
     <w:p>
       <w:pPr>
-        <w:pStyle w:val="Heading1"/>
+        <w:pStyle w:val="Heading2"/>
       </w:pPr>
       <w:r>
-        <w:t>7. Fonctionnalités de l'application</w:t>
-      </w:r>
-    </w:p>
-    <w:p>
-      <w:pPr>
-        <w:pStyle w:val="ListBullet"/>
-        <w:spacing w:after="80"/>
-      </w:pPr>
-      <w:r>
-        <w:rPr>
-          <w:color w:val="1F2937"/>
-          <w:sz w:val="22"/>
-        </w:rPr>
-        <w:t>Importation de fichiers WhatsApp aux formats .txt et .zip.</w:t>
-      </w:r>
-    </w:p>
-    <w:p>
-      <w:pPr>
-        <w:pStyle w:val="ListBullet"/>
-        <w:spacing w:after="80"/>
-      </w:pPr>
-      <w:r>
-        <w:rPr>
-          <w:color w:val="1F2937"/>
-          <w:sz w:val="22"/>
-        </w:rPr>
-        <w:t>Extraction automatique du fichier texte de conversation contenu dans une archive compressée.</w:t>
-      </w:r>
-    </w:p>
-    <w:p>
-      <w:pPr>
-        <w:pStyle w:val="ListBullet"/>
-        <w:spacing w:after="80"/>
-      </w:pPr>
-      <w:r>
-        <w:rPr>
-          <w:color w:val="1F2937"/>
-          <w:sz w:val="22"/>
-        </w:rPr>
-        <w:t>Détection de la langue de chaque message, y compris en cas de mélange de langues.</w:t>
-      </w:r>
-    </w:p>
-    <w:p>
-      <w:pPr>
-        <w:pStyle w:val="ListBullet"/>
-        <w:spacing w:after="80"/>
-      </w:pPr>
-      <w:r>
-        <w:rPr>
-          <w:color w:val="1F2937"/>
-          <w:sz w:val="22"/>
-        </w:rPr>
-        <w:t>Classification du sentiment en quatre catégories : positif, neutre, négatif, inconnu.</w:t>
-      </w:r>
-    </w:p>
-    <w:p>
-      <w:pPr>
-        <w:pStyle w:val="ListBullet"/>
-        <w:spacing w:after="80"/>
-      </w:pPr>
-      <w:r>
-        <w:rPr>
-          <w:color w:val="1F2937"/>
-          <w:sz w:val="22"/>
-        </w:rPr>
-        <w:t>Détection de l'émotion dominante exprimée dans le message.</w:t>
-      </w:r>
-    </w:p>
-    <w:p>
-      <w:pPr>
-        <w:pStyle w:val="ListBullet"/>
-        <w:spacing w:after="80"/>
-      </w:pPr>
-      <w:r>
-        <w:rPr>
-          <w:color w:val="1F2937"/>
-          <w:sz w:val="22"/>
-        </w:rPr>
-        <w:t>Génération automatique d'un résumé de chaque message en français.</w:t>
-      </w:r>
-    </w:p>
-    <w:p>
-      <w:pPr>
-        <w:pStyle w:val="ListBullet"/>
-        <w:spacing w:after="80"/>
-      </w:pPr>
-      <w:r>
-        <w:rPr>
-          <w:color w:val="1F2937"/>
-          <w:sz w:val="22"/>
-        </w:rPr>
-        <w:t>Recherche textuelle parmi les messages importés.</w:t>
-      </w:r>
-    </w:p>
-    <w:p>
-      <w:pPr>
-        <w:pStyle w:val="ListBullet"/>
-        <w:spacing w:after="80"/>
-      </w:pPr>
-      <w:r>
-        <w:rPr>
-          <w:color w:val="1F2937"/>
-          <w:sz w:val="22"/>
-        </w:rPr>
-        <w:t>Filtrage des messages par catégorie de sentiment.</w:t>
-      </w:r>
-    </w:p>
-    <w:p>
-      <w:pPr>
-        <w:pStyle w:val="ListBullet"/>
-        <w:spacing w:after="80"/>
-      </w:pPr>
-      <w:r>
-        <w:rPr>
-          <w:color w:val="1F2937"/>
-          <w:sz w:val="22"/>
-        </w:rPr>
-        <w:t>Graphique de tendance du sentiment sur des périodes de vingt-quatre heures, sept, trente ou quatre-vingt-dix jours.</w:t>
-      </w:r>
-    </w:p>
-    <w:p>
-      <w:pPr>
-        <w:pStyle w:val="ListBullet"/>
-        <w:spacing w:after="80"/>
-      </w:pPr>
-      <w:r>
-        <w:rPr>
-          <w:color w:val="1F2937"/>
-          <w:sz w:val="22"/>
-        </w:rPr>
-        <w:t>Graphique de répartition des émotions détectées.</w:t>
-      </w:r>
-    </w:p>
-    <w:p>
-      <w:pPr>
-        <w:pStyle w:val="ListBullet"/>
-        <w:spacing w:after="80"/>
-      </w:pPr>
-      <w:r>
-        <w:rPr>
-          <w:color w:val="1F2937"/>
-          <w:sz w:val="22"/>
-        </w:rPr>
-        <w:t>Détection et signalement automatique des pics de sentiment négatif.</w:t>
-      </w:r>
-    </w:p>
-    <w:p>
-      <w:pPr>
-        <w:pStyle w:val="Heading1"/>
-      </w:pPr>
-      <w:r>
-        <w:t>8. Présentation de l'interface utilisateur</w:t>
+        <w:t>6.5. Sélection automatique du meilleur point de contrôle</w:t>
       </w:r>
     </w:p>
     <w:p>
@@ -1540,7 +1281,7 @@
           <w:color w:val="1F2937"/>
           <w:sz w:val="22"/>
         </w:rPr>
-        <w:t>L'interface, développée avec Next.js et une bibliothèque de composants fondée sur Radix UI, s'organise autour de deux espaces principaux, accessibles par onglets.</w:t>
+        <w:t>Pour ne plus dépendre d'un nombre d'époques fixé à l'avance, j'ai modifié le script d'entraînement afin qu'il évalue le F1 macro de validation après chaque époque et n'enregistre le modèle sur disque que lorsque ce score s'améliore. Le point de contrôle finalement conservé est donc le meilleur observé pendant l'entraînement, et non celui de la dernière époque. Une nouvelle exécution sur 6 époques a confirmé et reproduit ce mécanisme : la meilleure époque était la quatrième, avec les mêmes résultats que la tentative précédente (F1 macro de test de 0,505).</w:t>
       </w:r>
     </w:p>
     <w:p>
@@ -1548,7 +1289,7 @@
         <w:pStyle w:val="Heading2"/>
       </w:pPr>
       <w:r>
-        <w:t>8.1. Onglet Accueil</w:t>
+        <w:t>6.6. Analyse des erreurs par langue et incohérence d'annotation</w:t>
       </w:r>
     </w:p>
     <w:p>
@@ -1562,15 +1303,7 @@
           <w:color w:val="1F2937"/>
           <w:sz w:val="22"/>
         </w:rPr>
-        <w:t>Cet onglet permet le dépôt du fichier d'export WhatsApp, le lancement de l'importation et de la classification, ainsi que le suivi de la progression du traitement.</w:t>
-      </w:r>
-    </w:p>
-    <w:p>
-      <w:pPr>
-        <w:pStyle w:val="Heading2"/>
-      </w:pPr>
-      <w:r>
-        <w:t>8.2. Onglet Vue d'ensemble</w:t>
+        <w:t>Face à des résultats encore modestes, j'ai réparti les messages de l'ensemble de test en deux groupes selon leur langue dominante (français ou swahili de Bukavu, détectée par un comptage de mots-outils) pour vérifier si le français, langue majoritaire du corpus, obtenait de meilleurs résultats. L'exactitude était de 53,3 % sur les messages à dominante française contre 50,6 % sur les messages à dominante swahili, un écart trop faible pour expliquer les résultats limités : les deux groupes présentaient le même défaut, une confusion fréquente entre les messages réellement neutres et la classe négative.</w:t>
       </w:r>
     </w:p>
     <w:p>
@@ -1584,7 +1317,7 @@
           <w:color w:val="1F2937"/>
           <w:sz w:val="22"/>
         </w:rPr>
-        <w:t>Cet onglet présente une synthèse visuelle des résultats : indicateurs numériques globaux, graphique de tendance du sentiment, répartition des émotions et alertes relatives à un éventuel pic de sentiment négatif.</w:t>
+        <w:t>En examinant l'origine de cette confusion, j'ai relié le problème à la manière dont les données avaient été annotées par lots séparés : certains lots classaient beaucoup plus de messages en négatif que d'autres pour un contenu comparable, un signe d'incohérence entre lots plutôt qu'une difficulté propre à une langue.</w:t>
       </w:r>
     </w:p>
     <w:p>
@@ -1592,7 +1325,7 @@
         <w:pStyle w:val="Heading2"/>
       </w:pPr>
       <w:r>
-        <w:t>8.3. Onglet Messages</w:t>
+        <w:t>6.7. Réannotation du sous-corpus français</w:t>
       </w:r>
     </w:p>
     <w:p>
@@ -1606,15 +1339,7 @@
           <w:color w:val="1F2937"/>
           <w:sz w:val="22"/>
         </w:rPr>
-        <w:t>Cet onglet donne accès à la liste détaillée des messages classés, avec possibilité de recherche textuelle et de filtrage par sentiment.</w:t>
-      </w:r>
-    </w:p>
-    <w:p>
-      <w:pPr>
-        <w:pStyle w:val="Heading1"/>
-      </w:pPr>
-      <w:r>
-        <w:t>9. Aspects techniques et choix d'implémentation</w:t>
+        <w:t>J'ai réannoté les 883 messages à dominante française du corpus avec une grille unique et stricte, précisant explicitement que les affirmations factuelles, les scores sportifs et les formules de réassurance devaient être classés neutres par défaut, et réservant la classe négative aux plaintes, critiques ou marques d'hostilité exprimées par le locuteur lui-même. Cette réannotation a fait passer la part de messages négatifs dans ce sous-corpus d'environ 21 % à environ 6 %. Le corpus complet compte, après cette correction, 320 messages positifs, 1 056 neutres et 192 négatifs pour un total inchangé de 1 568 messages.</w:t>
       </w:r>
     </w:p>
     <w:p>
@@ -1622,7 +1347,7 @@
         <w:pStyle w:val="Heading2"/>
       </w:pPr>
       <w:r>
-        <w:t>9.1. Sécurité et limites d'importation</w:t>
+        <w:t>6.8. Déséquilibre des classes et pondération de la fonction de perte</w:t>
       </w:r>
     </w:p>
     <w:p>
@@ -1636,15 +1361,7 @@
           <w:color w:val="1F2937"/>
           <w:sz w:val="22"/>
         </w:rPr>
-        <w:t>Plusieurs limites de taille sont appliquées lors de l'importation, tant sur le fichier envoyé que sur son contenu extrait, afin de prévenir tout traitement excessif ou abusif. Les archives compressées sont analysées pour n'en extraire que le fichier texte de conversation, les fichiers multimédias éventuellement présents n'étant pas traités.</w:t>
-      </w:r>
-    </w:p>
-    <w:p>
-      <w:pPr>
-        <w:pStyle w:val="Heading2"/>
-      </w:pPr>
-      <w:r>
-        <w:t>9.2. Validation stricte des réponses du modèle</w:t>
+        <w:t>Un nouvel entraînement sur ce corpus corrigé a fait progresser l'exactitude à 65-69 %, mais le F1 macro a légèrement reculé (0,44 à 0,48). L'examen de la matrice de confusion a montré la cause : la classe neutre représentant désormais 67 % des exemples d'entraînement, le modèle obtenait une bonne exactitude apparente en prédisant « neutre » par défaut, au prix d'un rappel très faible sur les classes positive (23 %) et négative (21 %).</w:t>
       </w:r>
     </w:p>
     <w:p>
@@ -1658,15 +1375,15 @@
           <w:color w:val="1F2937"/>
           <w:sz w:val="22"/>
         </w:rPr>
-        <w:t>Toute réponse produite par le modèle Gemini est systématiquement validée avant son enregistrement : vérification de l'appartenance du sentiment et de l'émotion aux catégories autorisées, contrôle de la plage de confiance, et limitation de la longueur des champs textuels. Cette validation garantit la cohérence et la fiabilité des données conservées, indépendamment des variations possibles dans la réponse du modèle.</w:t>
+        <w:t>La fonction de perte utilisée jusque-là était une entropie croisée non pondérée, qui laisse un modèle minimiser sa perte moyenne en favorisant la classe majoritaire lorsque les classes sont déséquilibrées. J'ai corrigé le script d'entraînement pour pondérer chaque classe par l'inverse de sa fréquence dans l'ensemble d'entraînement, de sorte qu'une erreur sur un message négatif ou positif pèse proportionnellement plus qu'une erreur sur un message neutre. Cette correction était la dernière apportée au script au moment de la rédaction de ce document ; sa validation par un nouvel entraînement complet reste à effectuer.</w:t>
       </w:r>
     </w:p>
     <w:p>
       <w:pPr>
-        <w:pStyle w:val="Heading2"/>
+        <w:pStyle w:val="Heading1"/>
       </w:pPr>
       <w:r>
-        <w:t>9.3. Classification par lots</w:t>
+        <w:t>7. Résultats obtenus</w:t>
       </w:r>
     </w:p>
     <w:p>
@@ -1680,17 +1397,403 @@
           <w:color w:val="1F2937"/>
           <w:sz w:val="22"/>
         </w:rPr>
-        <w:t>Le regroupement des messages en lots avant leur envoi au modèle Gemini répond à un objectif d'efficacité : il réduit le nombre d'appels réseau nécessaires et évite de répéter, pour chaque message, l'ensemble des instructions de classification. Cette optimisation reste néanmoins transparente pour l'utilisateur, la validation individuelle de chaque résultat étant préservée à l'intérieur de chaque lot. Le paramètre GEMINI_BATCH_SIZE permet d'ajuster ce compromis entre le nombre d'appels effectués et la longueur de chaque requête, notamment lorsque les messages traités sont particulièrement longs.</w:t>
+        <w:t>Le tableau suivant résume la progression des indicateurs de validation et de test au long des principales étapes d'entraînement décrites ci-dessus.</w:t>
       </w:r>
     </w:p>
-    <w:p>
-      <w:pPr>
-        <w:pStyle w:val="Heading2"/>
-      </w:pPr>
-      <w:r>
-        <w:t>9.4. Mode de démonstration</w:t>
-      </w:r>
-    </w:p>
+    <w:tbl>
+      <w:tblPr>
+        <w:tblStyle w:val="TableGrid"/>
+        <w:tblW w:type="auto" w:w="0"/>
+        <w:jc w:val="center"/>
+        <w:tblLook w:firstColumn="1" w:firstRow="1" w:lastColumn="0" w:lastRow="0" w:noHBand="0" w:noVBand="1" w:val="04A0"/>
+      </w:tblPr>
+      <w:tblGrid>
+        <w:gridCol w:w="2351"/>
+        <w:gridCol w:w="2351"/>
+        <w:gridCol w:w="2351"/>
+        <w:gridCol w:w="2351"/>
+      </w:tblGrid>
+      <w:tr>
+        <w:tc>
+          <w:tcPr>
+            <w:tcW w:type="dxa" w:w="3118"/>
+            <w:shd w:val="clear" w:color="auto" w:fill="0F6266"/>
+          </w:tcPr>
+          <w:p>
+            <w:r/>
+            <w:r>
+              <w:rPr>
+                <w:b/>
+                <w:color w:val="FFFFFF"/>
+                <w:sz w:val="20"/>
+              </w:rPr>
+              <w:t>Étape</w:t>
+            </w:r>
+          </w:p>
+        </w:tc>
+        <w:tc>
+          <w:tcPr>
+            <w:tcW w:type="dxa" w:w="1701"/>
+            <w:shd w:val="clear" w:color="auto" w:fill="0F6266"/>
+          </w:tcPr>
+          <w:p>
+            <w:r/>
+            <w:r>
+              <w:rPr>
+                <w:b/>
+                <w:color w:val="FFFFFF"/>
+                <w:sz w:val="20"/>
+              </w:rPr>
+              <w:t>Exactitude (test)</w:t>
+            </w:r>
+          </w:p>
+        </w:tc>
+        <w:tc>
+          <w:tcPr>
+            <w:tcW w:type="dxa" w:w="1701"/>
+            <w:shd w:val="clear" w:color="auto" w:fill="0F6266"/>
+          </w:tcPr>
+          <w:p>
+            <w:r/>
+            <w:r>
+              <w:rPr>
+                <w:b/>
+                <w:color w:val="FFFFFF"/>
+                <w:sz w:val="20"/>
+              </w:rPr>
+              <w:t>F1 macro (test)</w:t>
+            </w:r>
+          </w:p>
+        </w:tc>
+        <w:tc>
+          <w:tcPr>
+            <w:tcW w:type="dxa" w:w="2835"/>
+            <w:shd w:val="clear" w:color="auto" w:fill="0F6266"/>
+          </w:tcPr>
+          <w:p>
+            <w:r/>
+            <w:r>
+              <w:rPr>
+                <w:b/>
+                <w:color w:val="FFFFFF"/>
+                <w:sz w:val="20"/>
+              </w:rPr>
+              <w:t>Constat principal</w:t>
+            </w:r>
+          </w:p>
+        </w:tc>
+      </w:tr>
+      <w:tr>
+        <w:tc>
+          <w:tcPr>
+            <w:tcW w:type="dxa" w:w="3118"/>
+          </w:tcPr>
+          <w:p>
+            <w:r/>
+            <w:r>
+              <w:rPr>
+                <w:color w:val="1F2937"/>
+                <w:sz w:val="20"/>
+              </w:rPr>
+              <w:t>Tête figée, taux 2e-5</w:t>
+            </w:r>
+          </w:p>
+        </w:tc>
+        <w:tc>
+          <w:tcPr>
+            <w:tcW w:type="dxa" w:w="1701"/>
+          </w:tcPr>
+          <w:p>
+            <w:r/>
+            <w:r>
+              <w:rPr>
+                <w:color w:val="1F2937"/>
+                <w:sz w:val="20"/>
+              </w:rPr>
+              <w:t>53 %</w:t>
+            </w:r>
+          </w:p>
+        </w:tc>
+        <w:tc>
+          <w:tcPr>
+            <w:tcW w:type="dxa" w:w="1701"/>
+          </w:tcPr>
+          <w:p>
+            <w:r/>
+            <w:r>
+              <w:rPr>
+                <w:color w:val="1F2937"/>
+                <w:sz w:val="20"/>
+              </w:rPr>
+              <w:t>0,23</w:t>
+            </w:r>
+          </w:p>
+        </w:tc>
+        <w:tc>
+          <w:tcPr>
+            <w:tcW w:type="dxa" w:w="2835"/>
+          </w:tcPr>
+          <w:p>
+            <w:r/>
+            <w:r>
+              <w:rPr>
+                <w:color w:val="1F2937"/>
+                <w:sz w:val="20"/>
+              </w:rPr>
+              <w:t>Effondrement sur la classe majoritaire</w:t>
+            </w:r>
+          </w:p>
+        </w:tc>
+      </w:tr>
+      <w:tr>
+        <w:tc>
+          <w:tcPr>
+            <w:tcW w:type="dxa" w:w="3118"/>
+          </w:tcPr>
+          <w:p>
+            <w:r/>
+            <w:r>
+              <w:rPr>
+                <w:color w:val="1F2937"/>
+                <w:sz w:val="20"/>
+              </w:rPr>
+              <w:t>Tête figée, taux 1e-3</w:t>
+            </w:r>
+          </w:p>
+        </w:tc>
+        <w:tc>
+          <w:tcPr>
+            <w:tcW w:type="dxa" w:w="1701"/>
+          </w:tcPr>
+          <w:p>
+            <w:r/>
+            <w:r>
+              <w:rPr>
+                <w:color w:val="1F2937"/>
+                <w:sz w:val="20"/>
+              </w:rPr>
+              <w:t>49 %</w:t>
+            </w:r>
+          </w:p>
+        </w:tc>
+        <w:tc>
+          <w:tcPr>
+            <w:tcW w:type="dxa" w:w="1701"/>
+          </w:tcPr>
+          <w:p>
+            <w:r/>
+            <w:r>
+              <w:rPr>
+                <w:color w:val="1F2937"/>
+                <w:sz w:val="20"/>
+              </w:rPr>
+              <w:t>0,37</w:t>
+            </w:r>
+          </w:p>
+        </w:tc>
+        <w:tc>
+          <w:tcPr>
+            <w:tcW w:type="dxa" w:w="2835"/>
+          </w:tcPr>
+          <w:p>
+            <w:r/>
+            <w:r>
+              <w:rPr>
+                <w:color w:val="1F2937"/>
+                <w:sz w:val="20"/>
+              </w:rPr>
+              <w:t>Représentations figées insuffisantes</w:t>
+            </w:r>
+          </w:p>
+        </w:tc>
+      </w:tr>
+      <w:tr>
+        <w:tc>
+          <w:tcPr>
+            <w:tcW w:type="dxa" w:w="3118"/>
+          </w:tcPr>
+          <w:p>
+            <w:r/>
+            <w:r>
+              <w:rPr>
+                <w:color w:val="1F2937"/>
+                <w:sz w:val="20"/>
+              </w:rPr>
+              <w:t>Ajustement complet, 4 époques</w:t>
+            </w:r>
+          </w:p>
+        </w:tc>
+        <w:tc>
+          <w:tcPr>
+            <w:tcW w:type="dxa" w:w="1701"/>
+          </w:tcPr>
+          <w:p>
+            <w:r/>
+            <w:r>
+              <w:rPr>
+                <w:color w:val="1F2937"/>
+                <w:sz w:val="20"/>
+              </w:rPr>
+              <w:t>52 %</w:t>
+            </w:r>
+          </w:p>
+        </w:tc>
+        <w:tc>
+          <w:tcPr>
+            <w:tcW w:type="dxa" w:w="1701"/>
+          </w:tcPr>
+          <w:p>
+            <w:r/>
+            <w:r>
+              <w:rPr>
+                <w:color w:val="1F2937"/>
+                <w:sz w:val="20"/>
+              </w:rPr>
+              <w:t>0,505</w:t>
+            </w:r>
+          </w:p>
+        </w:tc>
+        <w:tc>
+          <w:tcPr>
+            <w:tcW w:type="dxa" w:w="2835"/>
+          </w:tcPr>
+          <w:p>
+            <w:r/>
+            <w:r>
+              <w:rPr>
+                <w:color w:val="1F2937"/>
+                <w:sz w:val="20"/>
+              </w:rPr>
+              <w:t>Meilleur résultat avant correction des labels</w:t>
+            </w:r>
+          </w:p>
+        </w:tc>
+      </w:tr>
+      <w:tr>
+        <w:tc>
+          <w:tcPr>
+            <w:tcW w:type="dxa" w:w="3118"/>
+          </w:tcPr>
+          <w:p>
+            <w:r/>
+            <w:r>
+              <w:rPr>
+                <w:color w:val="1F2937"/>
+                <w:sz w:val="20"/>
+              </w:rPr>
+              <w:t>Ajustement complet, 10 époques</w:t>
+            </w:r>
+          </w:p>
+        </w:tc>
+        <w:tc>
+          <w:tcPr>
+            <w:tcW w:type="dxa" w:w="1701"/>
+          </w:tcPr>
+          <w:p>
+            <w:r/>
+            <w:r>
+              <w:rPr>
+                <w:color w:val="1F2937"/>
+                <w:sz w:val="20"/>
+              </w:rPr>
+              <w:t>51 %</w:t>
+            </w:r>
+          </w:p>
+        </w:tc>
+        <w:tc>
+          <w:tcPr>
+            <w:tcW w:type="dxa" w:w="1701"/>
+          </w:tcPr>
+          <w:p>
+            <w:r/>
+            <w:r>
+              <w:rPr>
+                <w:color w:val="1F2937"/>
+                <w:sz w:val="20"/>
+              </w:rPr>
+              <w:t>0,467</w:t>
+            </w:r>
+          </w:p>
+        </w:tc>
+        <w:tc>
+          <w:tcPr>
+            <w:tcW w:type="dxa" w:w="2835"/>
+          </w:tcPr>
+          <w:p>
+            <w:r/>
+            <w:r>
+              <w:rPr>
+                <w:color w:val="1F2937"/>
+                <w:sz w:val="20"/>
+              </w:rPr>
+              <w:t>Surapprentissage au-delà de l'époque 4-5</w:t>
+            </w:r>
+          </w:p>
+        </w:tc>
+      </w:tr>
+      <w:tr>
+        <w:tc>
+          <w:tcPr>
+            <w:tcW w:type="dxa" w:w="3118"/>
+          </w:tcPr>
+          <w:p>
+            <w:r/>
+            <w:r>
+              <w:rPr>
+                <w:color w:val="1F2937"/>
+                <w:sz w:val="20"/>
+              </w:rPr>
+              <w:t>Après réannotation du français</w:t>
+            </w:r>
+          </w:p>
+        </w:tc>
+        <w:tc>
+          <w:tcPr>
+            <w:tcW w:type="dxa" w:w="1701"/>
+          </w:tcPr>
+          <w:p>
+            <w:r/>
+            <w:r>
+              <w:rPr>
+                <w:color w:val="1F2937"/>
+                <w:sz w:val="20"/>
+              </w:rPr>
+              <w:t>65 %</w:t>
+            </w:r>
+          </w:p>
+        </w:tc>
+        <w:tc>
+          <w:tcPr>
+            <w:tcW w:type="dxa" w:w="1701"/>
+          </w:tcPr>
+          <w:p>
+            <w:r/>
+            <w:r>
+              <w:rPr>
+                <w:color w:val="1F2937"/>
+                <w:sz w:val="20"/>
+              </w:rPr>
+              <w:t>0,445</w:t>
+            </w:r>
+          </w:p>
+        </w:tc>
+        <w:tc>
+          <w:tcPr>
+            <w:tcW w:type="dxa" w:w="2835"/>
+          </w:tcPr>
+          <w:p>
+            <w:r/>
+            <w:r>
+              <w:rPr>
+                <w:color w:val="1F2937"/>
+                <w:sz w:val="20"/>
+              </w:rPr>
+              <w:t>Biais vers la classe neutre majoritaire</w:t>
+            </w:r>
+          </w:p>
+        </w:tc>
+      </w:tr>
+    </w:tbl>
     <w:p>
       <w:pPr>
         <w:spacing w:after="160"/>
@@ -1702,29 +1805,7 @@
           <w:color w:val="1F2937"/>
           <w:sz w:val="22"/>
         </w:rPr>
-        <w:t>Un mode de démonstration permet de tester l'interface sans clé d'accès valide au modèle Gemini. Dans ce mode, les messages sont importés et enregistrés sans classification réelle, ce qui facilite la présentation de l'application dans un contexte académique sans dépendance à un service externe.</w:t>
-      </w:r>
-    </w:p>
-    <w:p>
-      <w:pPr>
-        <w:pStyle w:val="Heading2"/>
-      </w:pPr>
-      <w:r>
-        <w:t>9.5. Configuration et déploiement local</w:t>
-      </w:r>
-    </w:p>
-    <w:p>
-      <w:pPr>
-        <w:spacing w:after="160"/>
-      </w:pPr>
-      <w:r>
-        <w:rPr>
-          <w:b w:val="0"/>
-          <w:i w:val="0"/>
-          <w:color w:val="1F2937"/>
-          <w:sz w:val="22"/>
-        </w:rPr>
-        <w:t>L'application est conçue pour un déploiement local simple, sans dépendance à une infrastructure complexe. Le backend utilise une base de données SQLite créée automatiquement au premier démarrage, tandis que le client Next.js communique avec le backend par l'intermédiaire d'une adresse configurable.</w:t>
+        <w:t>Ces résultats restent modestes pour une tâche à trois classes, et cela reflète des contraintes réelles plutôt qu'un simple manque d'ajustement : un corpus d'entraînement de 1 098 messages est réduit pour ajuster complètement un modèle de type transformeur, l'annotation rapide d'un tel volume introduit nécessairement du bruit, et le mélange de français, de swahili de Bukavu et d'argot dans un même message est une difficulté linguistique intrinsèque, non un artefact du modèle.</w:t>
       </w:r>
     </w:p>
     <w:p>
@@ -1732,7 +1813,7 @@
         <w:pStyle w:val="Heading1"/>
       </w:pPr>
       <w:r>
-        <w:t>10. Limites et défis rencontrés</w:t>
+        <w:t>8. Fonctionnalités de l'application</w:t>
       </w:r>
     </w:p>
     <w:p>
@@ -1745,7 +1826,7 @@
           <w:color w:val="1F2937"/>
           <w:sz w:val="22"/>
         </w:rPr>
-        <w:t>La qualité de la classification dépend directement du modèle de langage sollicité et peut varier selon la complexité ou l'ambiguïté du message analysé.</w:t>
+        <w:t>Importation de fichiers WhatsApp .txt et .zip.</w:t>
       </w:r>
     </w:p>
     <w:p>
@@ -1758,7 +1839,7 @@
           <w:color w:val="1F2937"/>
           <w:sz w:val="22"/>
         </w:rPr>
-        <w:t>L'analyse syntaxique des exports WhatsApp doit composer avec une diversité de formats de date, ce qui peut ne pas couvrir l'ensemble des variantes existantes.</w:t>
+        <w:t>Classification locale en trois catégories : positif, neutre, négatif.</w:t>
       </w:r>
     </w:p>
     <w:p>
@@ -1771,7 +1852,7 @@
           <w:color w:val="1F2937"/>
           <w:sz w:val="22"/>
         </w:rPr>
-        <w:t>Bien que les messages soient désormais regroupés en lots avant leur envoi au modèle, les différents lots sont encore traités de manière séquentielle, ce qui peut allonger la durée de traitement pour des conversations volumineuses.</w:t>
+        <w:t>Filtre par période prédéfinie (24 heures, 7, 30, 90 jours) ou par plage de dates personnalisée.</w:t>
       </w:r>
     </w:p>
     <w:p>
@@ -1784,7 +1865,7 @@
           <w:color w:val="1F2937"/>
           <w:sz w:val="22"/>
         </w:rPr>
-        <w:t>Un lot entier est rejeté dès qu'un seul de ses résultats est invalide ou manquant, ce qui impose de reclasser l'ensemble du lot plutôt que le seul message concerné.</w:t>
+        <w:t>Tableau de bord synchronisé sur la période effectivement sélectionnée (tendance, répartition par sentiment, texture émotionnelle).</w:t>
       </w:r>
     </w:p>
     <w:p>
@@ -1797,7 +1878,7 @@
           <w:color w:val="1F2937"/>
           <w:sz w:val="22"/>
         </w:rPr>
-        <w:t>La classification étant réalisée par un service externe, l'application dépend de la disponibilité de ce service pour fonctionner en mode réel.</w:t>
+        <w:t>Détection et signalement d'un pic de sentiment négatif.</w:t>
       </w:r>
     </w:p>
     <w:p>
@@ -1810,7 +1891,405 @@
           <w:color w:val="1F2937"/>
           <w:sz w:val="22"/>
         </w:rPr>
-        <w:t>Les fichiers multimédias joints à une conversation ne sont pas analysés, l'étude portant exclusivement sur le contenu textuel.</w:t>
+        <w:t>Recherche et filtre des messages par sentiment.</w:t>
+      </w:r>
+    </w:p>
+    <w:p>
+      <w:pPr>
+        <w:pStyle w:val="ListBullet"/>
+        <w:spacing w:after="80"/>
+      </w:pPr>
+      <w:r>
+        <w:rPr>
+          <w:color w:val="1F2937"/>
+          <w:sz w:val="22"/>
+        </w:rPr>
+        <w:t>Suppression complète des messages stockés, avec confirmation explicite.</w:t>
+      </w:r>
+    </w:p>
+    <w:p>
+      <w:pPr>
+        <w:pStyle w:val="Heading1"/>
+      </w:pPr>
+      <w:r>
+        <w:t>9. Difficultés rencontrées et solutions apportées</w:t>
+      </w:r>
+    </w:p>
+    <w:tbl>
+      <w:tblPr>
+        <w:tblStyle w:val="TableGrid"/>
+        <w:tblW w:type="auto" w:w="0"/>
+        <w:jc w:val="center"/>
+        <w:tblLook w:firstColumn="1" w:firstRow="1" w:lastColumn="0" w:lastRow="0" w:noHBand="0" w:noVBand="1" w:val="04A0"/>
+      </w:tblPr>
+      <w:tblGrid>
+        <w:gridCol w:w="4703"/>
+        <w:gridCol w:w="4703"/>
+      </w:tblGrid>
+      <w:tr>
+        <w:tc>
+          <w:tcPr>
+            <w:tcW w:type="dxa" w:w="4535"/>
+            <w:shd w:val="clear" w:color="auto" w:fill="0F6266"/>
+          </w:tcPr>
+          <w:p>
+            <w:r/>
+            <w:r>
+              <w:rPr>
+                <w:b/>
+                <w:color w:val="FFFFFF"/>
+                <w:sz w:val="20"/>
+              </w:rPr>
+              <w:t>Difficulté rencontrée</w:t>
+            </w:r>
+          </w:p>
+        </w:tc>
+        <w:tc>
+          <w:tcPr>
+            <w:tcW w:type="dxa" w:w="4819"/>
+            <w:shd w:val="clear" w:color="auto" w:fill="0F6266"/>
+          </w:tcPr>
+          <w:p>
+            <w:r/>
+            <w:r>
+              <w:rPr>
+                <w:b/>
+                <w:color w:val="FFFFFF"/>
+                <w:sz w:val="20"/>
+              </w:rPr>
+              <w:t>Solution apportée</w:t>
+            </w:r>
+          </w:p>
+        </w:tc>
+      </w:tr>
+      <w:tr>
+        <w:tc>
+          <w:tcPr>
+            <w:tcW w:type="dxa" w:w="4535"/>
+          </w:tcPr>
+          <w:p>
+            <w:r/>
+            <w:r>
+              <w:rPr>
+                <w:color w:val="1F2937"/>
+                <w:sz w:val="20"/>
+              </w:rPr>
+              <w:t>Format de date WhatsApp non reconnu (export américain sur 24 heures), faisant échouer l'analyse.</w:t>
+            </w:r>
+          </w:p>
+        </w:tc>
+        <w:tc>
+          <w:tcPr>
+            <w:tcW w:type="dxa" w:w="4819"/>
+          </w:tcPr>
+          <w:p>
+            <w:r/>
+            <w:r>
+              <w:rPr>
+                <w:color w:val="1F2937"/>
+                <w:sz w:val="20"/>
+              </w:rPr>
+              <w:t>Ajout des formats de date manquants dans l'analyseur.</w:t>
+            </w:r>
+          </w:p>
+        </w:tc>
+      </w:tr>
+      <w:tr>
+        <w:tc>
+          <w:tcPr>
+            <w:tcW w:type="dxa" w:w="4535"/>
+          </w:tcPr>
+          <w:p>
+            <w:r/>
+            <w:r>
+              <w:rPr>
+                <w:color w:val="1F2937"/>
+                <w:sz w:val="20"/>
+              </w:rPr>
+              <w:t>Message au texte vide provoquant une erreur d'extraction.</w:t>
+            </w:r>
+          </w:p>
+        </w:tc>
+        <w:tc>
+          <w:tcPr>
+            <w:tcW w:type="dxa" w:w="4819"/>
+          </w:tcPr>
+          <w:p>
+            <w:r/>
+            <w:r>
+              <w:rPr>
+                <w:color w:val="1F2937"/>
+                <w:sz w:val="20"/>
+              </w:rPr>
+              <w:t>Correction de la logique d'extraction du texte du message.</w:t>
+            </w:r>
+          </w:p>
+        </w:tc>
+      </w:tr>
+      <w:tr>
+        <w:tc>
+          <w:tcPr>
+            <w:tcW w:type="dxa" w:w="4535"/>
+          </w:tcPr>
+          <w:p>
+            <w:r/>
+            <w:r>
+              <w:rPr>
+                <w:color w:val="1F2937"/>
+                <w:sz w:val="20"/>
+              </w:rPr>
+              <w:t>Sous-représentation du français dans le premier échantillon annoté.</w:t>
+            </w:r>
+          </w:p>
+        </w:tc>
+        <w:tc>
+          <w:tcPr>
+            <w:tcW w:type="dxa" w:w="4819"/>
+          </w:tcPr>
+          <w:p>
+            <w:r/>
+            <w:r>
+              <w:rPr>
+                <w:color w:val="1F2937"/>
+                <w:sz w:val="20"/>
+              </w:rPr>
+              <w:t>Prélèvement et annotation d'un second lot ciblant les messages à dominante française.</w:t>
+            </w:r>
+          </w:p>
+        </w:tc>
+      </w:tr>
+      <w:tr>
+        <w:tc>
+          <w:tcPr>
+            <w:tcW w:type="dxa" w:w="4535"/>
+          </w:tcPr>
+          <w:p>
+            <w:r/>
+            <w:r>
+              <w:rPr>
+                <w:color w:val="1F2937"/>
+                <w:sz w:val="20"/>
+              </w:rPr>
+              <w:t>Effondrement du modèle sur la classe majoritaire dès la première tentative.</w:t>
+            </w:r>
+          </w:p>
+        </w:tc>
+        <w:tc>
+          <w:tcPr>
+            <w:tcW w:type="dxa" w:w="4819"/>
+          </w:tcPr>
+          <w:p>
+            <w:r/>
+            <w:r>
+              <w:rPr>
+                <w:color w:val="1F2937"/>
+                <w:sz w:val="20"/>
+              </w:rPr>
+              <w:t>Diagnostic d'un taux d'apprentissage inadapté à une tête entraînée depuis zéro, puis correction.</w:t>
+            </w:r>
+          </w:p>
+        </w:tc>
+      </w:tr>
+      <w:tr>
+        <w:tc>
+          <w:tcPr>
+            <w:tcW w:type="dxa" w:w="4535"/>
+          </w:tcPr>
+          <w:p>
+            <w:r/>
+            <w:r>
+              <w:rPr>
+                <w:color w:val="1F2937"/>
+                <w:sz w:val="20"/>
+              </w:rPr>
+              <w:t>Surapprentissage au-delà d'un certain nombre d'époques.</w:t>
+            </w:r>
+          </w:p>
+        </w:tc>
+        <w:tc>
+          <w:tcPr>
+            <w:tcW w:type="dxa" w:w="4819"/>
+          </w:tcPr>
+          <w:p>
+            <w:r/>
+            <w:r>
+              <w:rPr>
+                <w:color w:val="1F2937"/>
+                <w:sz w:val="20"/>
+              </w:rPr>
+              <w:t>Ajout d'une évaluation de validation après chaque époque et sauvegarde du seul meilleur point de contrôle.</w:t>
+            </w:r>
+          </w:p>
+        </w:tc>
+      </w:tr>
+      <w:tr>
+        <w:tc>
+          <w:tcPr>
+            <w:tcW w:type="dxa" w:w="4535"/>
+          </w:tcPr>
+          <w:p>
+            <w:r/>
+            <w:r>
+              <w:rPr>
+                <w:color w:val="1F2937"/>
+                <w:sz w:val="20"/>
+              </w:rPr>
+              <w:t>Confusion fréquente entre messages neutres et négatifs.</w:t>
+            </w:r>
+          </w:p>
+        </w:tc>
+        <w:tc>
+          <w:tcPr>
+            <w:tcW w:type="dxa" w:w="4819"/>
+          </w:tcPr>
+          <w:p>
+            <w:r/>
+            <w:r>
+              <w:rPr>
+                <w:color w:val="1F2937"/>
+                <w:sz w:val="20"/>
+              </w:rPr>
+              <w:t>Analyse par langue montrant une incohérence d'annotation entre lots, suivie d'une réannotation avec grille unique.</w:t>
+            </w:r>
+          </w:p>
+        </w:tc>
+      </w:tr>
+      <w:tr>
+        <w:tc>
+          <w:tcPr>
+            <w:tcW w:type="dxa" w:w="4535"/>
+          </w:tcPr>
+          <w:p>
+            <w:r/>
+            <w:r>
+              <w:rPr>
+                <w:color w:val="1F2937"/>
+                <w:sz w:val="20"/>
+              </w:rPr>
+              <w:t>Biais vers la classe neutre après correction des labels.</w:t>
+            </w:r>
+          </w:p>
+        </w:tc>
+        <w:tc>
+          <w:tcPr>
+            <w:tcW w:type="dxa" w:w="4819"/>
+          </w:tcPr>
+          <w:p>
+            <w:r/>
+            <w:r>
+              <w:rPr>
+                <w:color w:val="1F2937"/>
+                <w:sz w:val="20"/>
+              </w:rPr>
+              <w:t>Pondération de la fonction de perte selon l'inverse de la fréquence de chaque classe.</w:t>
+            </w:r>
+          </w:p>
+        </w:tc>
+      </w:tr>
+      <w:tr>
+        <w:tc>
+          <w:tcPr>
+            <w:tcW w:type="dxa" w:w="4535"/>
+          </w:tcPr>
+          <w:p>
+            <w:r/>
+            <w:r>
+              <w:rPr>
+                <w:color w:val="1F2937"/>
+                <w:sz w:val="20"/>
+              </w:rPr>
+              <w:t>Échec d'importation lorsque deux messages partagent le même horodatage et le même texte.</w:t>
+            </w:r>
+          </w:p>
+        </w:tc>
+        <w:tc>
+          <w:tcPr>
+            <w:tcW w:type="dxa" w:w="4819"/>
+          </w:tcPr>
+          <w:p>
+            <w:r/>
+            <w:r>
+              <w:rPr>
+                <w:color w:val="1F2937"/>
+                <w:sz w:val="20"/>
+              </w:rPr>
+              <w:t>Retrait volontaire du mécanisme de détection de doublons, remplacé par une insertion systématique de chaque message.</w:t>
+            </w:r>
+          </w:p>
+        </w:tc>
+      </w:tr>
+    </w:tbl>
+    <w:p>
+      <w:pPr>
+        <w:pStyle w:val="Heading1"/>
+      </w:pPr>
+      <w:r>
+        <w:t>10. Limites actuelles</w:t>
+      </w:r>
+    </w:p>
+    <w:p>
+      <w:pPr>
+        <w:pStyle w:val="ListBullet"/>
+        <w:spacing w:after="80"/>
+      </w:pPr>
+      <w:r>
+        <w:rPr>
+          <w:color w:val="1F2937"/>
+          <w:sz w:val="22"/>
+        </w:rPr>
+        <w:t>La correction par pondération de la fonction de perte n'a pas encore été validée par un entraînement complet au moment de la rédaction de ce document.</w:t>
+      </w:r>
+    </w:p>
+    <w:p>
+      <w:pPr>
+        <w:pStyle w:val="ListBullet"/>
+        <w:spacing w:after="80"/>
+      </w:pPr>
+      <w:r>
+        <w:rPr>
+          <w:color w:val="1F2937"/>
+          <w:sz w:val="22"/>
+        </w:rPr>
+        <w:t>Le corpus annoté (1 568 messages) reste modeste pour un ajustement complet de transformeur sur trois classes.</w:t>
+      </w:r>
+    </w:p>
+    <w:p>
+      <w:pPr>
+        <w:pStyle w:val="ListBullet"/>
+        <w:spacing w:after="80"/>
+      </w:pPr>
+      <w:r>
+        <w:rPr>
+          <w:color w:val="1F2937"/>
+          <w:sz w:val="22"/>
+        </w:rPr>
+        <w:t>L'annotation rapide d'un tel volume introduit un bruit résiduel, notamment sur les messages courts ou fortement ambigus.</w:t>
+      </w:r>
+    </w:p>
+    <w:p>
+      <w:pPr>
+        <w:pStyle w:val="ListBullet"/>
+        <w:spacing w:after="80"/>
+      </w:pPr>
+      <w:r>
+        <w:rPr>
+          <w:color w:val="1F2937"/>
+          <w:sz w:val="22"/>
+        </w:rPr>
+        <w:t>Le modèle reste sensible à l'argot spécifique au swahili de Bukavu, pour lequel aucune ressource linguistique de référence n'a été utilisée en dehors des messages réels du corpus.</w:t>
+      </w:r>
+    </w:p>
+    <w:p>
+      <w:pPr>
+        <w:pStyle w:val="ListBullet"/>
+        <w:spacing w:after="80"/>
+      </w:pPr>
+      <w:r>
+        <w:rPr>
+          <w:color w:val="1F2937"/>
+          <w:sz w:val="22"/>
+        </w:rPr>
+        <w:t>L'inférence s'effectue sur processeur, ce qui limite le débit de classification pour un import volumineux.</w:t>
       </w:r>
     </w:p>
     <w:p>
@@ -1831,7 +2310,7 @@
           <w:color w:val="1F2937"/>
           <w:sz w:val="22"/>
         </w:rPr>
-        <w:t>Paralléliser l'envoi des différents lots de messages afin de réduire le temps d'importation des conversations volumineuses, ceux-ci étant actuellement traités de façon séquentielle.</w:t>
+        <w:t>Valider la pondération de la fonction de perte par un entraînement complet et comparer son F1 macro à celui obtenu sans pondération.</w:t>
       </w:r>
     </w:p>
     <w:p>
@@ -1844,7 +2323,7 @@
           <w:color w:val="1F2937"/>
           <w:sz w:val="22"/>
         </w:rPr>
-        <w:t>Étendre la reconnaissance des formats de date afin de couvrir un plus grand nombre de configurations régionales de WhatsApp.</w:t>
+        <w:t>Étendre le corpus annoté, en particulier sur les classes positive et négative qui restent minoritaires.</w:t>
       </w:r>
     </w:p>
     <w:p>
@@ -1857,7 +2336,7 @@
           <w:color w:val="1F2937"/>
           <w:sz w:val="22"/>
         </w:rPr>
-        <w:t>Introduire une analyse par participant, permettant de comparer la tonalité des échanges entre les différents membres d'une conversation.</w:t>
+        <w:t>Réannoter également le sous-corpus swahili de Bukavu avec la grille stricte utilisée pour le français, par cohérence.</w:t>
       </w:r>
     </w:p>
     <w:p>
@@ -1870,7 +2349,7 @@
           <w:color w:val="1F2937"/>
           <w:sz w:val="22"/>
         </w:rPr>
-        <w:t>Ajouter un mécanisme de mise en cache des classifications afin de limiter le nombre d'appels au modèle de langage.</w:t>
+        <w:t>Constituer un ensemble de test supplémentaire, entièrement composé de messages récents du groupe cible non utilisés à l'entraînement, pour une évaluation finale indépendante.</w:t>
       </w:r>
     </w:p>
     <w:p>
@@ -1883,7 +2362,7 @@
           <w:color w:val="1F2937"/>
           <w:sz w:val="22"/>
         </w:rPr>
-        <w:t>Permettre l'export des résultats du tableau de bord sous forme de rapport.</w:t>
+        <w:t>Explorer une accélération de l'inférence pour les imports volumineux.</w:t>
       </w:r>
     </w:p>
     <w:p>
@@ -1905,7 +2384,7 @@
           <w:color w:val="1F2937"/>
           <w:sz w:val="22"/>
         </w:rPr>
-        <w:t>Le projet « WhatsApp Sentiment Lab » démontre la faisabilité d'une chaîne complète de traitement allant de l'importation d'un export de conversation brut jusqu'à sa restitution sous forme d'indicateurs analytiques exploitables. L'intégration d'un modèle de langage pour la classification multilingue du sentiment et de l'émotion permet de s'affranchir des limites des approches lexicales traditionnelles, notamment face à la diversité linguistique et au registre informel propre aux conversations WhatsApp.</w:t>
+        <w:t>Ce projet a consisté à remplacer une classification par appel à un service externe par un classifieur de sentiment réellement entraîné sur des données réelles d'un groupe WhatsApp. La démarche suivie n'a pas été linéaire : chaque tentative d'entraînement a révélé un problème précis (taux d'apprentissage inadapté, surapprentissage, incohérence d'annotation, déséquilibre des classes), diagnostiqué puis corrigé avant de passer à l'étape suivante. Cette itération, bien que plus longue qu'un entraînement unique, a permis de comprendre les résultats obtenus plutôt que de les subir.</w:t>
       </w:r>
     </w:p>
     <w:p>
@@ -1919,7 +2398,7 @@
           <w:color w:val="1F2937"/>
           <w:sz w:val="22"/>
         </w:rPr>
-        <w:t>Au-delà de sa dimension technique, ce projet illustre l'apport concret de l'intelligence artificielle appliquée au traitement du langage naturel dans un contexte de communication quotidienne, où elle permet de révéler des tendances difficilement perceptibles à l'œil nu, telles qu'une dégradation progressive du climat d'un groupe ou l'apparition d'un pic de messages négatifs. Les limites identifiées, notamment la dépendance à un service externe et la nécessité d'une analyse syntaxique robuste, ouvrent la voie à des travaux complémentaires visant à renforcer la fiabilité et l'autonomie du système.</w:t>
+        <w:t>Les résultats actuels restent modestes et une correction reste à valider, mais le processus complet, de l'extraction des données réelles jusqu'au diagnostic des erreurs du modèle, correspond à une démarche d'apprentissage automatique complète, bien au-delà d'un simple appel à un modèle de langage préexistant.</w:t>
       </w:r>
     </w:p>
     <w:p>
@@ -1928,6 +2407,45 @@
       </w:pPr>
       <w:r>
         <w:t>13. Références</w:t>
+      </w:r>
+    </w:p>
+    <w:p>
+      <w:pPr>
+        <w:pStyle w:val="ListBullet"/>
+        <w:spacing w:after="80"/>
+      </w:pPr>
+      <w:r>
+        <w:rPr>
+          <w:color w:val="1F2937"/>
+          <w:sz w:val="22"/>
+        </w:rPr>
+        <w:t>Documentation du modèle AfroXLMR, Davlan/afro-xlmr-small, Hugging Face.</w:t>
+      </w:r>
+    </w:p>
+    <w:p>
+      <w:pPr>
+        <w:pStyle w:val="ListBullet"/>
+        <w:spacing w:after="80"/>
+      </w:pPr>
+      <w:r>
+        <w:rPr>
+          <w:color w:val="1F2937"/>
+          <w:sz w:val="22"/>
+        </w:rPr>
+        <w:t>Documentation de la bibliothèque Transformers, https://huggingface.co/docs/transformers</w:t>
+      </w:r>
+    </w:p>
+    <w:p>
+      <w:pPr>
+        <w:pStyle w:val="ListBullet"/>
+        <w:spacing w:after="80"/>
+      </w:pPr>
+      <w:r>
+        <w:rPr>
+          <w:color w:val="1F2937"/>
+          <w:sz w:val="22"/>
+        </w:rPr>
+        <w:t>Documentation de PyTorch, https://pytorch.org/docs</w:t>
       </w:r>
     </w:p>
     <w:p>
@@ -1954,45 +2472,6 @@
           <w:sz w:val="22"/>
         </w:rPr>
         <w:t>Documentation officielle de Next.js, https://nextjs.org/docs</w:t>
-      </w:r>
-    </w:p>
-    <w:p>
-      <w:pPr>
-        <w:pStyle w:val="ListBullet"/>
-        <w:spacing w:after="80"/>
-      </w:pPr>
-      <w:r>
-        <w:rPr>
-          <w:color w:val="1F2937"/>
-          <w:sz w:val="22"/>
-        </w:rPr>
-        <w:t>Documentation de l'API Gemini, Google AI for Developers, https://ai.google.dev</w:t>
-      </w:r>
-    </w:p>
-    <w:p>
-      <w:pPr>
-        <w:pStyle w:val="ListBullet"/>
-        <w:spacing w:after="80"/>
-      </w:pPr>
-      <w:r>
-        <w:rPr>
-          <w:color w:val="1F2937"/>
-          <w:sz w:val="22"/>
-        </w:rPr>
-        <w:t>Documentation de la bibliothèque SQLite3 du langage Python, https://docs.python.org/3/library/sqlite3.html</w:t>
-      </w:r>
-    </w:p>
-    <w:p>
-      <w:pPr>
-        <w:pStyle w:val="ListBullet"/>
-        <w:spacing w:after="80"/>
-      </w:pPr>
-      <w:r>
-        <w:rPr>
-          <w:color w:val="1F2937"/>
-          <w:sz w:val="22"/>
-        </w:rPr>
-        <w:t>Documentation de la bibliothèque Recharts, https://recharts.org</w:t>
       </w:r>
     </w:p>
     <w:sectPr>

</xml_diff>